<commit_message>
- fix for picture number not in order and not consistent with picture number in the table - Fix for template spacing after logo image
</commit_message>
<xml_diff>
--- a/aop/ICCA_TEMPLATE.docx
+++ b/aop/ICCA_TEMPLATE.docx
@@ -1092,9 +1092,7 @@
         <w:spacing w:after="0" w:line="240" w:lineRule="auto"/>
         <w:ind w:left="7200" w:firstLine="720"/>
         <w:rPr>
-          <w:rFonts w:ascii="Arial" w:eastAsia="Arial" w:hAnsi="Arial"/>
-          <w:color w:val="696969"/>
-          <w:sz w:val="24"/>
+          <w:noProof/>
           <w:lang w:val="nl-NL"/>
         </w:rPr>
       </w:pPr>
@@ -1107,62 +1105,7 @@
       </w:r>
       <w:r>
         <w:rPr>
-          <w:rFonts w:ascii="Arial" w:eastAsia="Arial" w:hAnsi="Arial"/>
-          <w:color w:val="696969"/>
-          <w:sz w:val="24"/>
-          <w:lang w:val="nl-NL"/>
-        </w:rPr>
-        <w:tab/>
-      </w:r>
-      <w:r>
-        <w:rPr>
-          <w:rFonts w:ascii="Arial" w:eastAsia="Arial" w:hAnsi="Arial"/>
-          <w:color w:val="696969"/>
-          <w:sz w:val="24"/>
-          <w:lang w:val="nl-NL"/>
-        </w:rPr>
-        <w:tab/>
-      </w:r>
-      <w:r>
-        <w:rPr>
-          <w:rFonts w:ascii="Arial" w:eastAsia="Arial" w:hAnsi="Arial"/>
-          <w:color w:val="696969"/>
-          <w:sz w:val="24"/>
-          <w:lang w:val="nl-NL"/>
-        </w:rPr>
-        <w:tab/>
-      </w:r>
-    </w:p>
-    <w:p>
-      <w:pPr>
-        <w:rPr>
-          <w:lang w:val="nl-NL"/>
-        </w:rPr>
-      </w:pPr>
-    </w:p>
-    <w:p>
-      <w:pPr>
-        <w:rPr>
-          <w:lang w:val="nl-NL"/>
-        </w:rPr>
-      </w:pPr>
-    </w:p>
-    <w:p>
-      <w:pPr>
-        <w:rPr>
-          <w:lang w:val="nl-NL"/>
-        </w:rPr>
-      </w:pPr>
-    </w:p>
-    <w:p>
-      <w:pPr>
-        <w:spacing w:after="160" w:line="259" w:lineRule="auto"/>
-        <w:rPr>
-          <w:lang w:val="nl-NL"/>
-        </w:rPr>
-      </w:pPr>
-      <w:r>
-        <w:rPr>
+          <w:noProof/>
           <w:lang w:val="nl-NL"/>
         </w:rPr>
         <w:br w:type="page"/>

</xml_diff>

<commit_message>
template modification for header
</commit_message>
<xml_diff>
--- a/aop/ICCA_TEMPLATE.docx
+++ b/aop/ICCA_TEMPLATE.docx
@@ -1114,10 +1114,20 @@
     </w:p>
     <w:p>
       <w:pPr>
+        <w:tabs>
+          <w:tab w:val="left" w:pos="3890"/>
+        </w:tabs>
         <w:rPr>
           <w:lang w:val="nl-NL"/>
         </w:rPr>
       </w:pPr>
+      <w:r>
+        <w:rPr>
+          <w:lang w:val="nl-NL"/>
+        </w:rPr>
+        <w:lastRenderedPageBreak/>
+        <w:tab/>
+      </w:r>
     </w:p>
     <w:p>
       <w:pPr>
@@ -7691,7 +7701,7 @@
       <mc:AlternateContent>
         <mc:Choice Requires="wps">
           <w:drawing>
-            <wp:anchor distT="45720" distB="45720" distL="114300" distR="114300" simplePos="0" relativeHeight="251664384" behindDoc="0" locked="0" layoutInCell="1" allowOverlap="1" wp14:anchorId="614BD227" wp14:editId="1D413F0E">
+            <wp:anchor distT="45720" distB="45720" distL="114300" distR="114300" simplePos="0" relativeHeight="251664384" behindDoc="0" locked="0" layoutInCell="1" allowOverlap="1" wp14:anchorId="614BD227" wp14:editId="50948A94">
               <wp:simplePos x="0" y="0"/>
               <wp:positionH relativeFrom="column">
                 <wp:posOffset>6350</wp:posOffset>
@@ -7732,6 +7742,218 @@
                     </wps:spPr>
                     <wps:txbx>
                       <w:txbxContent>
+                        <w:tbl>
+                          <w:tblPr>
+                            <w:tblStyle w:val="TableGrid"/>
+                            <w:tblW w:w="10530" w:type="dxa"/>
+                            <w:tblLook w:val="04A0" w:firstRow="1" w:lastRow="0" w:firstColumn="1" w:lastColumn="0" w:noHBand="0" w:noVBand="1"/>
+                          </w:tblPr>
+                          <w:tblGrid>
+                            <w:gridCol w:w="4675"/>
+                            <w:gridCol w:w="5855"/>
+                          </w:tblGrid>
+                          <w:tr>
+                            <w:trPr>
+                              <w:trHeight w:hRule="exact" w:val="360"/>
+                            </w:trPr>
+                            <w:tc>
+                              <w:tcPr>
+                                <w:tcW w:w="4675" w:type="dxa"/>
+                                <w:tcBorders>
+                                  <w:top w:val="nil"/>
+                                  <w:left w:val="nil"/>
+                                  <w:bottom w:val="nil"/>
+                                  <w:right w:val="nil"/>
+                                </w:tcBorders>
+                                <w:shd w:val="clear" w:color="auto" w:fill="458FA6"/>
+                              </w:tcPr>
+                              <w:p>
+                                <w:pPr>
+                                  <w:tabs>
+                                    <w:tab w:val="left" w:pos="3436"/>
+                                  </w:tabs>
+                                  <w:rPr>
+                                    <w:color w:val="FFFFFF" w:themeColor="background1"/>
+                                  </w:rPr>
+                                </w:pPr>
+                                <w:r>
+                                  <w:rPr>
+                                    <w:rFonts w:ascii="Arial" w:hAnsi="Arial" w:cs="Arial"/>
+                                    <w:i/>
+                                    <w:iCs/>
+                                    <w:color w:val="FFFFFF" w:themeColor="background1"/>
+                                    <w:sz w:val="20"/>
+                                    <w:szCs w:val="20"/>
+                                    <w:lang w:val="nl-NL"/>
+                                  </w:rPr>
+                                  <w:t xml:space="preserve">Project: </w:t>
+                                </w:r>
+                                <w:r>
+                                  <w:rPr>
+                                    <w:rFonts w:ascii="Arial" w:eastAsia="Arial" w:hAnsi="Arial" w:cs="Arial"/>
+                                    <w:i/>
+                                    <w:iCs/>
+                                    <w:color w:val="FFFFFF" w:themeColor="background1"/>
+                                    <w:sz w:val="20"/>
+                                    <w:szCs w:val="20"/>
+                                    <w:lang w:val="nl-NL"/>
+                                  </w:rPr>
+                                  <w:t>{project}</w:t>
+                                </w:r>
+                                <w:r>
+                                  <w:rPr>
+                                    <w:color w:val="FFFFFF" w:themeColor="background1"/>
+                                  </w:rPr>
+                                  <w:tab/>
+                                </w:r>
+                              </w:p>
+                            </w:tc>
+                            <w:tc>
+                              <w:tcPr>
+                                <w:tcW w:w="5855" w:type="dxa"/>
+                                <w:tcBorders>
+                                  <w:top w:val="nil"/>
+                                  <w:left w:val="nil"/>
+                                  <w:bottom w:val="nil"/>
+                                  <w:right w:val="nil"/>
+                                </w:tcBorders>
+                                <w:shd w:val="clear" w:color="auto" w:fill="458FA6"/>
+                              </w:tcPr>
+                              <w:p>
+                                <w:pPr>
+                                  <w:tabs>
+                                    <w:tab w:val="left" w:pos="360"/>
+                                  </w:tabs>
+                                  <w:rPr>
+                                    <w:color w:val="FFFFFF" w:themeColor="background1"/>
+                                  </w:rPr>
+                                </w:pPr>
+                                <w:r>
+                                  <w:rPr>
+                                    <w:rFonts w:ascii="Arial" w:eastAsia="Arial" w:hAnsi="Arial" w:cs="Arial"/>
+                                    <w:i/>
+                                    <w:iCs/>
+                                    <w:color w:val="FFFFFF" w:themeColor="background1"/>
+                                    <w:sz w:val="20"/>
+                                    <w:szCs w:val="20"/>
+                                    <w:lang w:val="nl-NL"/>
+                                  </w:rPr>
+                                  <w:t xml:space="preserve">     </w:t>
+                                </w:r>
+                                <w:r>
+                                  <w:rPr>
+                                    <w:rFonts w:ascii="Arial" w:eastAsia="Arial" w:hAnsi="Arial" w:cs="Arial"/>
+                                    <w:i/>
+                                    <w:iCs/>
+                                    <w:color w:val="FFFFFF" w:themeColor="background1"/>
+                                    <w:sz w:val="20"/>
+                                    <w:szCs w:val="20"/>
+                                    <w:lang w:val="nl-NL"/>
+                                  </w:rPr>
+                                  <w:t xml:space="preserve">                                 </w:t>
+                                </w:r>
+                                <w:r>
+                                  <w:rPr>
+                                    <w:rFonts w:ascii="Arial" w:eastAsia="Arial" w:hAnsi="Arial" w:cs="Arial"/>
+                                    <w:i/>
+                                    <w:iCs/>
+                                    <w:color w:val="FFFFFF" w:themeColor="background1"/>
+                                    <w:sz w:val="20"/>
+                                    <w:szCs w:val="20"/>
+                                    <w:lang w:val="nl-NL"/>
+                                  </w:rPr>
+                                  <w:t xml:space="preserve"> </w:t>
+                                </w:r>
+                                <w:r>
+                                  <w:rPr>
+                                    <w:rFonts w:ascii="Arial" w:eastAsia="Arial" w:hAnsi="Arial" w:cs="Arial"/>
+                                    <w:i/>
+                                    <w:iCs/>
+                                    <w:color w:val="FFFFFF" w:themeColor="background1"/>
+                                    <w:sz w:val="20"/>
+                                    <w:szCs w:val="20"/>
+                                    <w:lang w:val="nl-NL"/>
+                                  </w:rPr>
+                                  <w:t xml:space="preserve">                 </w:t>
+                                </w:r>
+                                <w:r>
+                                  <w:rPr>
+                                    <w:rFonts w:ascii="Arial" w:eastAsia="Arial" w:hAnsi="Arial" w:cs="Arial"/>
+                                    <w:i/>
+                                    <w:iCs/>
+                                    <w:color w:val="FFFFFF" w:themeColor="background1"/>
+                                    <w:sz w:val="20"/>
+                                    <w:szCs w:val="20"/>
+                                    <w:lang w:val="nl-NL"/>
+                                  </w:rPr>
+                                  <w:t>Rapportnummer:</w:t>
+                                </w:r>
+                                <w:r>
+                                  <w:rPr>
+                                    <w:rFonts w:ascii="Arial" w:eastAsia="Arial" w:hAnsi="Arial" w:cs="Arial"/>
+                                    <w:i/>
+                                    <w:iCs/>
+                                    <w:color w:val="FFFFFF" w:themeColor="background1"/>
+                                    <w:sz w:val="20"/>
+                                    <w:szCs w:val="20"/>
+                                    <w:lang w:val="nl-NL"/>
+                                  </w:rPr>
+                                  <w:t xml:space="preserve"> </w:t>
+                                </w:r>
+                                <w:r>
+                                  <w:rPr>
+                                    <w:rFonts w:ascii="Arial" w:eastAsia="Arial" w:hAnsi="Arial"/>
+                                    <w:i/>
+                                    <w:iCs/>
+                                    <w:color w:val="FFFFFF" w:themeColor="background1"/>
+                                    <w:sz w:val="20"/>
+                                    <w:szCs w:val="20"/>
+                                    <w:lang w:val="nl-NL"/>
+                                  </w:rPr>
+                                  <w:t>{</w:t>
+                                </w:r>
+                                <w:proofErr w:type="spellStart"/>
+                                <w:r>
+                                  <w:rPr>
+                                    <w:rFonts w:ascii="Arial" w:eastAsia="Arial" w:hAnsi="Arial"/>
+                                    <w:i/>
+                                    <w:iCs/>
+                                    <w:color w:val="FFFFFF" w:themeColor="background1"/>
+                                    <w:sz w:val="20"/>
+                                    <w:szCs w:val="20"/>
+                                    <w:lang w:val="nl-NL"/>
+                                  </w:rPr>
+                                  <w:t>rapport_nummer</w:t>
+                                </w:r>
+                                <w:proofErr w:type="spellEnd"/>
+                                <w:r>
+                                  <w:rPr>
+                                    <w:rFonts w:ascii="Arial" w:eastAsia="Arial" w:hAnsi="Arial"/>
+                                    <w:i/>
+                                    <w:iCs/>
+                                    <w:color w:val="FFFFFF" w:themeColor="background1"/>
+                                    <w:sz w:val="20"/>
+                                    <w:szCs w:val="20"/>
+                                    <w:lang w:val="nl-NL"/>
+                                  </w:rPr>
+                                  <w:t>}</w:t>
+                                </w:r>
+                                <w:r>
+                                  <w:rPr>
+                                    <w:rFonts w:ascii="Arial" w:eastAsia="Arial" w:hAnsi="Arial" w:cs="Arial"/>
+                                    <w:i/>
+                                    <w:iCs/>
+                                    <w:color w:val="FFFFFF" w:themeColor="background1"/>
+                                    <w:sz w:val="20"/>
+                                    <w:szCs w:val="20"/>
+                                    <w:lang w:val="nl-NL"/>
+                                  </w:rPr>
+                                  <w:br/>
+                                </w:r>
+                              </w:p>
+                            </w:tc>
+                          </w:tr>
+                        </w:tbl>
                         <w:p>
                           <w:pPr>
                             <w:rPr>
@@ -7742,6 +7964,67 @@
                               <w:sz w:val="20"/>
                               <w:szCs w:val="20"/>
                               <w:lang w:val="nl-NL"/>
+                            </w:rPr>
+                          </w:pPr>
+                        </w:p>
+                      </w:txbxContent>
+                    </wps:txbx>
+                    <wps:bodyPr rot="0" vert="horz" wrap="square" lIns="91440" tIns="45720" rIns="91440" bIns="45720" anchor="t" anchorCtr="0">
+                      <a:noAutofit/>
+                    </wps:bodyPr>
+                  </wps:wsp>
+                </a:graphicData>
+              </a:graphic>
+              <wp14:sizeRelH relativeFrom="margin">
+                <wp14:pctWidth>0</wp14:pctWidth>
+              </wp14:sizeRelH>
+              <wp14:sizeRelV relativeFrom="margin">
+                <wp14:pctHeight>0</wp14:pctHeight>
+              </wp14:sizeRelV>
+            </wp:anchor>
+          </w:drawing>
+        </mc:Choice>
+        <mc:Fallback>
+          <w:pict>
+            <v:shapetype w14:anchorId="614BD227" id="_x0000_t202" coordsize="21600,21600" o:spt="202" path="m,l,21600r21600,l21600,xe">
+              <v:stroke joinstyle="miter"/>
+              <v:path gradientshapeok="t" o:connecttype="rect"/>
+            </v:shapetype>
+            <v:shape id="_x0000_s1039" type="#_x0000_t202" style="position:absolute;margin-left:.5pt;margin-top:12.5pt;width:525.25pt;height:19.6pt;z-index:251664384;visibility:visible;mso-wrap-style:square;mso-width-percent:0;mso-height-percent:0;mso-wrap-distance-left:9pt;mso-wrap-distance-top:3.6pt;mso-wrap-distance-right:9pt;mso-wrap-distance-bottom:3.6pt;mso-position-horizontal:absolute;mso-position-horizontal-relative:text;mso-position-vertical:absolute;mso-position-vertical-relative:page;mso-width-percent:0;mso-height-percent:0;mso-width-relative:margin;mso-height-relative:margin;v-text-anchor:top" o:gfxdata="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" fillcolor="#458fa6" stroked="f">
+              <v:textbox>
+                <w:txbxContent>
+                  <w:tbl>
+                    <w:tblPr>
+                      <w:tblStyle w:val="TableGrid"/>
+                      <w:tblW w:w="10530" w:type="dxa"/>
+                      <w:tblLook w:val="04A0" w:firstRow="1" w:lastRow="0" w:firstColumn="1" w:lastColumn="0" w:noHBand="0" w:noVBand="1"/>
+                    </w:tblPr>
+                    <w:tblGrid>
+                      <w:gridCol w:w="4675"/>
+                      <w:gridCol w:w="5855"/>
+                    </w:tblGrid>
+                    <w:tr>
+                      <w:trPr>
+                        <w:trHeight w:hRule="exact" w:val="360"/>
+                      </w:trPr>
+                      <w:tc>
+                        <w:tcPr>
+                          <w:tcW w:w="4675" w:type="dxa"/>
+                          <w:tcBorders>
+                            <w:top w:val="nil"/>
+                            <w:left w:val="nil"/>
+                            <w:bottom w:val="nil"/>
+                            <w:right w:val="nil"/>
+                          </w:tcBorders>
+                          <w:shd w:val="clear" w:color="auto" w:fill="458FA6"/>
+                        </w:tcPr>
+                        <w:p>
+                          <w:pPr>
+                            <w:tabs>
+                              <w:tab w:val="left" w:pos="3436"/>
+                            </w:tabs>
+                            <w:rPr>
+                              <w:color w:val="FFFFFF" w:themeColor="background1"/>
                             </w:rPr>
                           </w:pPr>
                           <w:r>
@@ -7770,6 +8053,34 @@
                           </w:r>
                           <w:r>
                             <w:rPr>
+                              <w:color w:val="FFFFFF" w:themeColor="background1"/>
+                            </w:rPr>
+                            <w:tab/>
+                          </w:r>
+                        </w:p>
+                      </w:tc>
+                      <w:tc>
+                        <w:tcPr>
+                          <w:tcW w:w="5855" w:type="dxa"/>
+                          <w:tcBorders>
+                            <w:top w:val="nil"/>
+                            <w:left w:val="nil"/>
+                            <w:bottom w:val="nil"/>
+                            <w:right w:val="nil"/>
+                          </w:tcBorders>
+                          <w:shd w:val="clear" w:color="auto" w:fill="458FA6"/>
+                        </w:tcPr>
+                        <w:p>
+                          <w:pPr>
+                            <w:tabs>
+                              <w:tab w:val="left" w:pos="360"/>
+                            </w:tabs>
+                            <w:rPr>
+                              <w:color w:val="FFFFFF" w:themeColor="background1"/>
+                            </w:rPr>
+                          </w:pPr>
+                          <w:r>
+                            <w:rPr>
                               <w:rFonts w:ascii="Arial" w:eastAsia="Arial" w:hAnsi="Arial" w:cs="Arial"/>
                               <w:i/>
                               <w:iCs/>
@@ -7778,7 +8089,7 @@
                               <w:szCs w:val="20"/>
                               <w:lang w:val="nl-NL"/>
                             </w:rPr>
-                            <w:tab/>
+                            <w:t xml:space="preserve">     </w:t>
                           </w:r>
                           <w:r>
                             <w:rPr>
@@ -7790,7 +8101,7 @@
                               <w:szCs w:val="20"/>
                               <w:lang w:val="nl-NL"/>
                             </w:rPr>
-                            <w:tab/>
+                            <w:t xml:space="preserve">                                 </w:t>
                           </w:r>
                           <w:r>
                             <w:rPr>
@@ -7802,7 +8113,7 @@
                               <w:szCs w:val="20"/>
                               <w:lang w:val="nl-NL"/>
                             </w:rPr>
-                            <w:tab/>
+                            <w:t xml:space="preserve"> </w:t>
                           </w:r>
                           <w:r>
                             <w:rPr>
@@ -7814,7 +8125,7 @@
                               <w:szCs w:val="20"/>
                               <w:lang w:val="nl-NL"/>
                             </w:rPr>
-                            <w:tab/>
+                            <w:t xml:space="preserve">                 </w:t>
                           </w:r>
                           <w:r>
                             <w:rPr>
@@ -7826,7 +8137,7 @@
                               <w:szCs w:val="20"/>
                               <w:lang w:val="nl-NL"/>
                             </w:rPr>
-                            <w:tab/>
+                            <w:t>Rapportnummer:</w:t>
                           </w:r>
                           <w:r>
                             <w:rPr>
@@ -7838,20 +8149,7 @@
                               <w:szCs w:val="20"/>
                               <w:lang w:val="nl-NL"/>
                             </w:rPr>
-                            <w:tab/>
-                          </w:r>
-                          <w:r>
-                            <w:rPr>
-                              <w:rFonts w:ascii="Arial" w:eastAsia="Arial" w:hAnsi="Arial" w:cs="Arial"/>
-                              <w:i/>
-                              <w:iCs/>
-                              <w:color w:val="FFFFFF" w:themeColor="background1"/>
-                              <w:sz w:val="20"/>
-                              <w:szCs w:val="20"/>
-                              <w:lang w:val="nl-NL"/>
-                            </w:rPr>
-                            <w:tab/>
-                            <w:t>Rapportnummer:</w:t>
+                            <w:t xml:space="preserve"> </w:t>
                           </w:r>
                           <w:r>
                             <w:rPr>
@@ -7904,32 +8202,9 @@
                             <w:br/>
                           </w:r>
                         </w:p>
-                      </w:txbxContent>
-                    </wps:txbx>
-                    <wps:bodyPr rot="0" vert="horz" wrap="square" lIns="91440" tIns="45720" rIns="91440" bIns="45720" anchor="t" anchorCtr="0">
-                      <a:noAutofit/>
-                    </wps:bodyPr>
-                  </wps:wsp>
-                </a:graphicData>
-              </a:graphic>
-              <wp14:sizeRelH relativeFrom="margin">
-                <wp14:pctWidth>0</wp14:pctWidth>
-              </wp14:sizeRelH>
-              <wp14:sizeRelV relativeFrom="margin">
-                <wp14:pctHeight>0</wp14:pctHeight>
-              </wp14:sizeRelV>
-            </wp:anchor>
-          </w:drawing>
-        </mc:Choice>
-        <mc:Fallback>
-          <w:pict>
-            <v:shapetype w14:anchorId="614BD227" id="_x0000_t202" coordsize="21600,21600" o:spt="202" path="m,l,21600r21600,l21600,xe">
-              <v:stroke joinstyle="miter"/>
-              <v:path gradientshapeok="t" o:connecttype="rect"/>
-            </v:shapetype>
-            <v:shape id="_x0000_s1039" type="#_x0000_t202" style="position:absolute;margin-left:.5pt;margin-top:12.5pt;width:525.25pt;height:19.6pt;z-index:251664384;visibility:visible;mso-wrap-style:square;mso-width-percent:0;mso-height-percent:0;mso-wrap-distance-left:9pt;mso-wrap-distance-top:3.6pt;mso-wrap-distance-right:9pt;mso-wrap-distance-bottom:3.6pt;mso-position-horizontal:absolute;mso-position-horizontal-relative:text;mso-position-vertical:absolute;mso-position-vertical-relative:page;mso-width-percent:0;mso-height-percent:0;mso-width-relative:margin;mso-height-relative:margin;v-text-anchor:top" o:gfxdata="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" fillcolor="#458fa6" stroked="f">
-              <v:textbox>
-                <w:txbxContent>
+                      </w:tc>
+                    </w:tr>
+                  </w:tbl>
                   <w:p>
                     <w:pPr>
                       <w:rPr>
@@ -7942,165 +8217,6 @@
                         <w:lang w:val="nl-NL"/>
                       </w:rPr>
                     </w:pPr>
-                    <w:r>
-                      <w:rPr>
-                        <w:rFonts w:ascii="Arial" w:hAnsi="Arial" w:cs="Arial"/>
-                        <w:i/>
-                        <w:iCs/>
-                        <w:color w:val="FFFFFF" w:themeColor="background1"/>
-                        <w:sz w:val="20"/>
-                        <w:szCs w:val="20"/>
-                        <w:lang w:val="nl-NL"/>
-                      </w:rPr>
-                      <w:t xml:space="preserve">Project: </w:t>
-                    </w:r>
-                    <w:r>
-                      <w:rPr>
-                        <w:rFonts w:ascii="Arial" w:eastAsia="Arial" w:hAnsi="Arial" w:cs="Arial"/>
-                        <w:i/>
-                        <w:iCs/>
-                        <w:color w:val="FFFFFF" w:themeColor="background1"/>
-                        <w:sz w:val="20"/>
-                        <w:szCs w:val="20"/>
-                        <w:lang w:val="nl-NL"/>
-                      </w:rPr>
-                      <w:t>{project}</w:t>
-                    </w:r>
-                    <w:r>
-                      <w:rPr>
-                        <w:rFonts w:ascii="Arial" w:eastAsia="Arial" w:hAnsi="Arial" w:cs="Arial"/>
-                        <w:i/>
-                        <w:iCs/>
-                        <w:color w:val="FFFFFF" w:themeColor="background1"/>
-                        <w:sz w:val="20"/>
-                        <w:szCs w:val="20"/>
-                        <w:lang w:val="nl-NL"/>
-                      </w:rPr>
-                      <w:tab/>
-                    </w:r>
-                    <w:r>
-                      <w:rPr>
-                        <w:rFonts w:ascii="Arial" w:eastAsia="Arial" w:hAnsi="Arial" w:cs="Arial"/>
-                        <w:i/>
-                        <w:iCs/>
-                        <w:color w:val="FFFFFF" w:themeColor="background1"/>
-                        <w:sz w:val="20"/>
-                        <w:szCs w:val="20"/>
-                        <w:lang w:val="nl-NL"/>
-                      </w:rPr>
-                      <w:tab/>
-                    </w:r>
-                    <w:r>
-                      <w:rPr>
-                        <w:rFonts w:ascii="Arial" w:eastAsia="Arial" w:hAnsi="Arial" w:cs="Arial"/>
-                        <w:i/>
-                        <w:iCs/>
-                        <w:color w:val="FFFFFF" w:themeColor="background1"/>
-                        <w:sz w:val="20"/>
-                        <w:szCs w:val="20"/>
-                        <w:lang w:val="nl-NL"/>
-                      </w:rPr>
-                      <w:tab/>
-                    </w:r>
-                    <w:r>
-                      <w:rPr>
-                        <w:rFonts w:ascii="Arial" w:eastAsia="Arial" w:hAnsi="Arial" w:cs="Arial"/>
-                        <w:i/>
-                        <w:iCs/>
-                        <w:color w:val="FFFFFF" w:themeColor="background1"/>
-                        <w:sz w:val="20"/>
-                        <w:szCs w:val="20"/>
-                        <w:lang w:val="nl-NL"/>
-                      </w:rPr>
-                      <w:tab/>
-                    </w:r>
-                    <w:r>
-                      <w:rPr>
-                        <w:rFonts w:ascii="Arial" w:eastAsia="Arial" w:hAnsi="Arial" w:cs="Arial"/>
-                        <w:i/>
-                        <w:iCs/>
-                        <w:color w:val="FFFFFF" w:themeColor="background1"/>
-                        <w:sz w:val="20"/>
-                        <w:szCs w:val="20"/>
-                        <w:lang w:val="nl-NL"/>
-                      </w:rPr>
-                      <w:tab/>
-                    </w:r>
-                    <w:r>
-                      <w:rPr>
-                        <w:rFonts w:ascii="Arial" w:eastAsia="Arial" w:hAnsi="Arial" w:cs="Arial"/>
-                        <w:i/>
-                        <w:iCs/>
-                        <w:color w:val="FFFFFF" w:themeColor="background1"/>
-                        <w:sz w:val="20"/>
-                        <w:szCs w:val="20"/>
-                        <w:lang w:val="nl-NL"/>
-                      </w:rPr>
-                      <w:tab/>
-                    </w:r>
-                    <w:r>
-                      <w:rPr>
-                        <w:rFonts w:ascii="Arial" w:eastAsia="Arial" w:hAnsi="Arial" w:cs="Arial"/>
-                        <w:i/>
-                        <w:iCs/>
-                        <w:color w:val="FFFFFF" w:themeColor="background1"/>
-                        <w:sz w:val="20"/>
-                        <w:szCs w:val="20"/>
-                        <w:lang w:val="nl-NL"/>
-                      </w:rPr>
-                      <w:tab/>
-                      <w:t>Rapportnummer:</w:t>
-                    </w:r>
-                    <w:r>
-                      <w:rPr>
-                        <w:rFonts w:ascii="Arial" w:eastAsia="Arial" w:hAnsi="Arial"/>
-                        <w:i/>
-                        <w:iCs/>
-                        <w:color w:val="FFFFFF" w:themeColor="background1"/>
-                        <w:sz w:val="20"/>
-                        <w:szCs w:val="20"/>
-                        <w:lang w:val="nl-NL"/>
-                      </w:rPr>
-                      <w:t>{</w:t>
-                    </w:r>
-                    <w:proofErr w:type="spellStart"/>
-                    <w:r>
-                      <w:rPr>
-                        <w:rFonts w:ascii="Arial" w:eastAsia="Arial" w:hAnsi="Arial"/>
-                        <w:i/>
-                        <w:iCs/>
-                        <w:color w:val="FFFFFF" w:themeColor="background1"/>
-                        <w:sz w:val="20"/>
-                        <w:szCs w:val="20"/>
-                        <w:lang w:val="nl-NL"/>
-                      </w:rPr>
-                      <w:t>rapport_nummer</w:t>
-                    </w:r>
-                    <w:proofErr w:type="spellEnd"/>
-                    <w:r>
-                      <w:rPr>
-                        <w:rFonts w:ascii="Arial" w:eastAsia="Arial" w:hAnsi="Arial"/>
-                        <w:i/>
-                        <w:iCs/>
-                        <w:color w:val="FFFFFF" w:themeColor="background1"/>
-                        <w:sz w:val="20"/>
-                        <w:szCs w:val="20"/>
-                        <w:lang w:val="nl-NL"/>
-                      </w:rPr>
-                      <w:t>}</w:t>
-                    </w:r>
-                    <w:r>
-                      <w:rPr>
-                        <w:rFonts w:ascii="Arial" w:eastAsia="Arial" w:hAnsi="Arial" w:cs="Arial"/>
-                        <w:i/>
-                        <w:iCs/>
-                        <w:color w:val="FFFFFF" w:themeColor="background1"/>
-                        <w:sz w:val="20"/>
-                        <w:szCs w:val="20"/>
-                        <w:lang w:val="nl-NL"/>
-                      </w:rPr>
-                      <w:br/>
-                    </w:r>
                   </w:p>
                 </w:txbxContent>
               </v:textbox>

</xml_diff>

<commit_message>
WIP technical aspect images
</commit_message>
<xml_diff>
--- a/aop/ICCA_TEMPLATE.docx
+++ b/aop/ICCA_TEMPLATE.docx
@@ -465,27 +465,7 @@
           <w:sz w:val="24"/>
           <w:lang w:val="nl-NL"/>
         </w:rPr>
-        <w:t>{</w:t>
-      </w:r>
-      <w:proofErr w:type="spellStart"/>
-      <w:r>
-        <w:rPr>
-          <w:rFonts w:ascii="Arial" w:eastAsia="Arial" w:hAnsi="Arial"/>
-          <w:color w:val="696969"/>
-          <w:sz w:val="24"/>
-          <w:lang w:val="nl-NL"/>
-        </w:rPr>
-        <w:t>ter_attentie_van</w:t>
-      </w:r>
-      <w:proofErr w:type="spellEnd"/>
-      <w:r>
-        <w:rPr>
-          <w:rFonts w:ascii="Arial" w:eastAsia="Arial" w:hAnsi="Arial"/>
-          <w:color w:val="696969"/>
-          <w:sz w:val="24"/>
-          <w:lang w:val="nl-NL"/>
-        </w:rPr>
-        <w:t>}</w:t>
+        <w:t>{ter_attentie_van}</w:t>
       </w:r>
     </w:p>
     <w:p>
@@ -636,17 +616,7 @@
           <w:sz w:val="24"/>
           <w:lang w:val="nl-NL"/>
         </w:rPr>
-        <w:t>{</w:t>
-      </w:r>
-      <w:proofErr w:type="spellStart"/>
-      <w:r>
-        <w:rPr>
-          <w:rFonts w:ascii="Arial" w:eastAsia="Arial" w:hAnsi="Arial"/>
-          <w:color w:val="696969"/>
-          <w:sz w:val="24"/>
-          <w:lang w:val="nl-NL"/>
-        </w:rPr>
-        <w:t>rapport_n</w:t>
+        <w:t>{rapport_n</w:t>
       </w:r>
       <w:r>
         <w:rPr>
@@ -657,7 +627,6 @@
         </w:rPr>
         <w:t>ummer</w:t>
       </w:r>
-      <w:proofErr w:type="spellEnd"/>
       <w:r>
         <w:rPr>
           <w:rFonts w:ascii="Arial" w:eastAsia="Arial" w:hAnsi="Arial"/>
@@ -750,7 +719,6 @@
         </w:rPr>
         <w:t>{</w:t>
       </w:r>
-      <w:proofErr w:type="spellStart"/>
       <w:r>
         <w:rPr>
           <w:rFonts w:ascii="Arial" w:eastAsia="Arial" w:hAnsi="Arial"/>
@@ -760,7 +728,6 @@
         </w:rPr>
         <w:t>datum_controle</w:t>
       </w:r>
-      <w:proofErr w:type="spellEnd"/>
       <w:r>
         <w:rPr>
           <w:rFonts w:ascii="Arial" w:eastAsia="Arial" w:hAnsi="Arial"/>
@@ -833,27 +800,7 @@
           <w:sz w:val="24"/>
           <w:lang w:val="nl-NL"/>
         </w:rPr>
-        <w:t>{</w:t>
-      </w:r>
-      <w:proofErr w:type="spellStart"/>
-      <w:r>
-        <w:rPr>
-          <w:rFonts w:ascii="Arial" w:eastAsia="Arial" w:hAnsi="Arial"/>
-          <w:color w:val="696969"/>
-          <w:sz w:val="24"/>
-          <w:lang w:val="nl-NL"/>
-        </w:rPr>
-        <w:t>tijdstip_controle</w:t>
-      </w:r>
-      <w:proofErr w:type="spellEnd"/>
-      <w:r>
-        <w:rPr>
-          <w:rFonts w:ascii="Arial" w:eastAsia="Arial" w:hAnsi="Arial"/>
-          <w:color w:val="696969"/>
-          <w:sz w:val="24"/>
-          <w:lang w:val="nl-NL"/>
-        </w:rPr>
-        <w:t>}</w:t>
+        <w:t>{tijdstip_controle}</w:t>
       </w:r>
     </w:p>
     <w:p>
@@ -909,27 +856,7 @@
           <w:sz w:val="24"/>
           <w:lang w:val="nl-NL"/>
         </w:rPr>
-        <w:t>{</w:t>
-      </w:r>
-      <w:proofErr w:type="spellStart"/>
-      <w:r>
-        <w:rPr>
-          <w:rFonts w:ascii="Arial" w:eastAsia="Arial" w:hAnsi="Arial"/>
-          <w:color w:val="696969"/>
-          <w:sz w:val="24"/>
-          <w:lang w:val="nl-NL"/>
-        </w:rPr>
-        <w:t>controle_door</w:t>
-      </w:r>
-      <w:proofErr w:type="spellEnd"/>
-      <w:r>
-        <w:rPr>
-          <w:rFonts w:ascii="Arial" w:eastAsia="Arial" w:hAnsi="Arial"/>
-          <w:color w:val="696969"/>
-          <w:sz w:val="24"/>
-          <w:lang w:val="nl-NL"/>
-        </w:rPr>
-        <w:t>}</w:t>
+        <w:t>{controle_door}</w:t>
       </w:r>
     </w:p>
     <w:p>
@@ -993,27 +920,7 @@
           <w:sz w:val="24"/>
           <w:lang w:val="nl-NL"/>
         </w:rPr>
-        <w:t>{</w:t>
-      </w:r>
-      <w:proofErr w:type="spellStart"/>
-      <w:r>
-        <w:rPr>
-          <w:rFonts w:ascii="Arial" w:eastAsia="Arial" w:hAnsi="Arial"/>
-          <w:color w:val="696969"/>
-          <w:sz w:val="24"/>
-          <w:lang w:val="nl-NL"/>
-        </w:rPr>
-        <w:t>aanwezig_leverancier</w:t>
-      </w:r>
-      <w:proofErr w:type="spellEnd"/>
-      <w:r>
-        <w:rPr>
-          <w:rFonts w:ascii="Arial" w:eastAsia="Arial" w:hAnsi="Arial"/>
-          <w:color w:val="696969"/>
-          <w:sz w:val="24"/>
-          <w:lang w:val="nl-NL"/>
-        </w:rPr>
-        <w:t>}</w:t>
+        <w:t>{aanwezig_leverancier}</w:t>
       </w:r>
       <w:r>
         <w:rPr>
@@ -1171,55 +1078,35 @@
           <w:sz w:val="24"/>
           <w:lang w:val="nl-NL"/>
         </w:rPr>
+        <w:t xml:space="preserve">{datum_controle_volledig} </w:t>
+      </w:r>
+      <w:r>
+        <w:rPr>
+          <w:rFonts w:ascii="Arial" w:eastAsia="Arial" w:hAnsi="Arial"/>
+          <w:color w:val="696969"/>
+          <w:sz w:val="24"/>
+          <w:lang w:val="nl-NL"/>
+        </w:rPr>
+        <w:t>is in</w:t>
+      </w:r>
+      <w:r>
+        <w:rPr>
+          <w:rFonts w:ascii="Arial" w:eastAsia="Arial" w:hAnsi="Arial"/>
+          <w:color w:val="696969"/>
+          <w:sz w:val="24"/>
+          <w:lang w:val="nl-NL"/>
+        </w:rPr>
+        <w:t xml:space="preserve"> </w:t>
+      </w:r>
+      <w:r>
+        <w:rPr>
+          <w:rFonts w:ascii="Arial" w:eastAsia="Arial" w:hAnsi="Arial"/>
+          <w:color w:val="696969"/>
+          <w:sz w:val="24"/>
+          <w:lang w:val="nl-NL"/>
+        </w:rPr>
         <w:t>{</w:t>
       </w:r>
-      <w:proofErr w:type="spellStart"/>
-      <w:r>
-        <w:rPr>
-          <w:rFonts w:ascii="Arial" w:eastAsia="Arial" w:hAnsi="Arial"/>
-          <w:color w:val="696969"/>
-          <w:sz w:val="24"/>
-          <w:lang w:val="nl-NL"/>
-        </w:rPr>
-        <w:t>datum_controle_volledig</w:t>
-      </w:r>
-      <w:proofErr w:type="spellEnd"/>
-      <w:r>
-        <w:rPr>
-          <w:rFonts w:ascii="Arial" w:eastAsia="Arial" w:hAnsi="Arial"/>
-          <w:color w:val="696969"/>
-          <w:sz w:val="24"/>
-          <w:lang w:val="nl-NL"/>
-        </w:rPr>
-        <w:t xml:space="preserve">} </w:t>
-      </w:r>
-      <w:r>
-        <w:rPr>
-          <w:rFonts w:ascii="Arial" w:eastAsia="Arial" w:hAnsi="Arial"/>
-          <w:color w:val="696969"/>
-          <w:sz w:val="24"/>
-          <w:lang w:val="nl-NL"/>
-        </w:rPr>
-        <w:t>is in</w:t>
-      </w:r>
-      <w:r>
-        <w:rPr>
-          <w:rFonts w:ascii="Arial" w:eastAsia="Arial" w:hAnsi="Arial"/>
-          <w:color w:val="696969"/>
-          <w:sz w:val="24"/>
-          <w:lang w:val="nl-NL"/>
-        </w:rPr>
-        <w:t xml:space="preserve"> </w:t>
-      </w:r>
-      <w:r>
-        <w:rPr>
-          <w:rFonts w:ascii="Arial" w:eastAsia="Arial" w:hAnsi="Arial"/>
-          <w:color w:val="696969"/>
-          <w:sz w:val="24"/>
-          <w:lang w:val="nl-NL"/>
-        </w:rPr>
-        <w:t>{</w:t>
-      </w:r>
       <w:r>
         <w:rPr>
           <w:rFonts w:ascii="Arial" w:eastAsia="Arial" w:hAnsi="Arial"/>
@@ -1254,27 +1141,7 @@
           <w:sz w:val="24"/>
           <w:lang w:val="nl-NL"/>
         </w:rPr>
-        <w:t>{</w:t>
-      </w:r>
-      <w:proofErr w:type="spellStart"/>
-      <w:r>
-        <w:rPr>
-          <w:rFonts w:ascii="Arial" w:eastAsia="Arial" w:hAnsi="Arial"/>
-          <w:color w:val="696969"/>
-          <w:sz w:val="24"/>
-          <w:lang w:val="nl-NL"/>
-        </w:rPr>
-        <w:t>audit_straatnaam</w:t>
-      </w:r>
-      <w:proofErr w:type="spellEnd"/>
-      <w:r>
-        <w:rPr>
-          <w:rFonts w:ascii="Arial" w:eastAsia="Arial" w:hAnsi="Arial"/>
-          <w:color w:val="696969"/>
-          <w:sz w:val="24"/>
-          <w:lang w:val="nl-NL"/>
-        </w:rPr>
-        <w:t xml:space="preserve">} </w:t>
+        <w:t xml:space="preserve">{audit_straatnaam} </w:t>
       </w:r>
       <w:r>
         <w:rPr>
@@ -1292,27 +1159,7 @@
           <w:sz w:val="24"/>
           <w:lang w:val="nl-NL"/>
         </w:rPr>
-        <w:t>{</w:t>
-      </w:r>
-      <w:proofErr w:type="spellStart"/>
-      <w:r>
-        <w:rPr>
-          <w:rFonts w:ascii="Arial" w:eastAsia="Arial" w:hAnsi="Arial"/>
-          <w:color w:val="696969"/>
-          <w:sz w:val="24"/>
-          <w:lang w:val="nl-NL"/>
-        </w:rPr>
-        <w:t>audit_stad</w:t>
-      </w:r>
-      <w:proofErr w:type="spellEnd"/>
-      <w:r>
-        <w:rPr>
-          <w:rFonts w:ascii="Arial" w:eastAsia="Arial" w:hAnsi="Arial"/>
-          <w:color w:val="696969"/>
-          <w:sz w:val="24"/>
-          <w:lang w:val="nl-NL"/>
-        </w:rPr>
-        <w:t>}</w:t>
+        <w:t>{audit_stad}</w:t>
       </w:r>
       <w:r>
         <w:rPr>
@@ -1596,27 +1443,7 @@
           <w:sz w:val="24"/>
           <w:lang w:val="nl-NL"/>
         </w:rPr>
-        <w:t>Rapportnummer: {</w:t>
-      </w:r>
-      <w:proofErr w:type="spellStart"/>
-      <w:r>
-        <w:rPr>
-          <w:rFonts w:ascii="Arial" w:eastAsia="Arial" w:hAnsi="Arial"/>
-          <w:color w:val="696969"/>
-          <w:sz w:val="24"/>
-          <w:lang w:val="nl-NL"/>
-        </w:rPr>
-        <w:t>rapport_nummer</w:t>
-      </w:r>
-      <w:proofErr w:type="spellEnd"/>
-      <w:r>
-        <w:rPr>
-          <w:rFonts w:ascii="Arial" w:eastAsia="Arial" w:hAnsi="Arial"/>
-          <w:color w:val="696969"/>
-          <w:sz w:val="24"/>
-          <w:lang w:val="nl-NL"/>
-        </w:rPr>
-        <w:t>}</w:t>
+        <w:t>Rapportnummer: {rapport_nummer}</w:t>
       </w:r>
       <w:r>
         <w:rPr>
@@ -1711,23 +1538,7 @@
           </w:tcPr>
           <w:p>
             <w:r>
-              <w:t>{</w:t>
-            </w:r>
-            <w:proofErr w:type="spellStart"/>
-            <w:r>
-              <w:t>aopchart</w:t>
-            </w:r>
-            <w:proofErr w:type="spellEnd"/>
-            <w:r>
-              <w:t xml:space="preserve"> </w:t>
-            </w:r>
-            <w:proofErr w:type="spellStart"/>
-            <w:r>
-              <w:t>colChart</w:t>
-            </w:r>
-            <w:proofErr w:type="spellEnd"/>
-            <w:r>
-              <w:t>}</w:t>
+              <w:t>{aopchart colChart}</w:t>
             </w:r>
             <w:r>
               <w:br/>
@@ -1770,23 +1581,7 @@
               </w:tabs>
             </w:pPr>
             <w:r>
-              <w:t>{</w:t>
-            </w:r>
-            <w:proofErr w:type="spellStart"/>
-            <w:r>
-              <w:t>aopchart</w:t>
-            </w:r>
-            <w:proofErr w:type="spellEnd"/>
-            <w:r>
-              <w:t xml:space="preserve"> </w:t>
-            </w:r>
-            <w:proofErr w:type="spellStart"/>
-            <w:r>
-              <w:t>timelineChart</w:t>
-            </w:r>
-            <w:proofErr w:type="spellEnd"/>
-            <w:r>
-              <w:t>}</w:t>
+              <w:t>{aopchart timelineChart}</w:t>
             </w:r>
             <w:r>
               <w:br/>
@@ -1849,7 +1644,6 @@
               <w:br/>
               <w:t>Controle {</w:t>
             </w:r>
-            <w:proofErr w:type="spellStart"/>
             <w:r>
               <w:rPr>
                 <w:rFonts w:ascii="Arial" w:eastAsia="Arial" w:hAnsi="Arial"/>
@@ -1859,7 +1653,6 @@
               </w:rPr>
               <w:t>datum_controle_volledig</w:t>
             </w:r>
-            <w:proofErr w:type="spellEnd"/>
             <w:r>
               <w:rPr>
                 <w:rFonts w:ascii="Arial" w:eastAsia="Arial" w:hAnsi="Arial"/>
@@ -1882,30 +1675,14 @@
               <w:rPr>
                 <w:lang w:val="nl-NL"/>
               </w:rPr>
-              <w:t>{</w:t>
+              <w:t xml:space="preserve">{aopchart </w:t>
             </w:r>
-            <w:proofErr w:type="spellStart"/>
-            <w:r>
-              <w:rPr>
-                <w:lang w:val="nl-NL"/>
-              </w:rPr>
-              <w:t>aopchart</w:t>
-            </w:r>
-            <w:proofErr w:type="spellEnd"/>
-            <w:r>
-              <w:rPr>
-                <w:lang w:val="nl-NL"/>
-              </w:rPr>
-              <w:t xml:space="preserve"> </w:t>
-            </w:r>
-            <w:proofErr w:type="spellStart"/>
             <w:r>
               <w:rPr>
                 <w:lang w:val="nl-NL"/>
               </w:rPr>
               <w:t>stockChart</w:t>
             </w:r>
-            <w:proofErr w:type="spellEnd"/>
             <w:r>
               <w:rPr>
                 <w:lang w:val="nl-NL"/>
@@ -1983,7 +1760,6 @@
                                       <w:szCs w:val="10"/>
                                     </w:rPr>
                                   </w:pPr>
-                                  <w:proofErr w:type="spellStart"/>
                                   <w:r>
                                     <w:rPr>
                                       <w:rFonts w:ascii="Arial" w:hAnsi="Arial" w:cs="Arial"/>
@@ -1993,19 +1769,7 @@
                                       <w:sz w:val="10"/>
                                       <w:szCs w:val="10"/>
                                     </w:rPr>
-                                    <w:t>Dicht</w:t>
-                                  </w:r>
-                                  <w:proofErr w:type="spellEnd"/>
-                                  <w:r>
-                                    <w:rPr>
-                                      <w:rFonts w:ascii="Arial" w:hAnsi="Arial" w:cs="Arial"/>
-                                      <w:b/>
-                                      <w:bCs/>
-                                      <w:color w:val="FFFFFF" w:themeColor="background1"/>
-                                      <w:sz w:val="10"/>
-                                      <w:szCs w:val="10"/>
-                                    </w:rPr>
-                                    <w:t xml:space="preserve"> </w:t>
+                                    <w:t xml:space="preserve">Dicht </w:t>
                                   </w:r>
                                   <w:r>
                                     <w:rPr>
@@ -2018,7 +1782,6 @@
                                     </w:rPr>
                                     <w:br/>
                                   </w:r>
-                                  <w:proofErr w:type="spellStart"/>
                                   <w:r>
                                     <w:rPr>
                                       <w:rFonts w:ascii="Arial" w:hAnsi="Arial" w:cs="Arial"/>
@@ -2030,7 +1793,6 @@
                                     </w:rPr>
                                     <w:t>stof</w:t>
                                   </w:r>
-                                  <w:proofErr w:type="spellEnd"/>
                                 </w:p>
                               </w:txbxContent>
                             </wps:txbx>
@@ -2070,7 +1832,6 @@
                                 <w:szCs w:val="10"/>
                               </w:rPr>
                             </w:pPr>
-                            <w:proofErr w:type="spellStart"/>
                             <w:r>
                               <w:rPr>
                                 <w:rFonts w:ascii="Arial" w:hAnsi="Arial" w:cs="Arial"/>
@@ -2080,19 +1841,7 @@
                                 <w:sz w:val="10"/>
                                 <w:szCs w:val="10"/>
                               </w:rPr>
-                              <w:t>Dicht</w:t>
-                            </w:r>
-                            <w:proofErr w:type="spellEnd"/>
-                            <w:r>
-                              <w:rPr>
-                                <w:rFonts w:ascii="Arial" w:hAnsi="Arial" w:cs="Arial"/>
-                                <w:b/>
-                                <w:bCs/>
-                                <w:color w:val="FFFFFF" w:themeColor="background1"/>
-                                <w:sz w:val="10"/>
-                                <w:szCs w:val="10"/>
-                              </w:rPr>
-                              <w:t xml:space="preserve"> </w:t>
+                              <w:t xml:space="preserve">Dicht </w:t>
                             </w:r>
                             <w:r>
                               <w:rPr>
@@ -2105,7 +1854,6 @@
                               </w:rPr>
                               <w:br/>
                             </w:r>
-                            <w:proofErr w:type="spellStart"/>
                             <w:r>
                               <w:rPr>
                                 <w:rFonts w:ascii="Arial" w:hAnsi="Arial" w:cs="Arial"/>
@@ -2117,7 +1865,6 @@
                               </w:rPr>
                               <w:t>stof</w:t>
                             </w:r>
-                            <w:proofErr w:type="spellEnd"/>
                           </w:p>
                         </w:txbxContent>
                       </v:textbox>
@@ -2186,7 +1933,6 @@
                                       <w:szCs w:val="10"/>
                                     </w:rPr>
                                   </w:pPr>
-                                  <w:proofErr w:type="spellStart"/>
                                   <w:r>
                                     <w:rPr>
                                       <w:rFonts w:ascii="Arial" w:hAnsi="Arial" w:cs="Arial"/>
@@ -2220,7 +1966,6 @@
                                     </w:rPr>
                                     <w:t>rag</w:t>
                                   </w:r>
-                                  <w:proofErr w:type="spellEnd"/>
                                 </w:p>
                               </w:txbxContent>
                             </wps:txbx>
@@ -2260,7 +2005,6 @@
                                 <w:szCs w:val="10"/>
                               </w:rPr>
                             </w:pPr>
-                            <w:proofErr w:type="spellStart"/>
                             <w:r>
                               <w:rPr>
                                 <w:rFonts w:ascii="Arial" w:hAnsi="Arial" w:cs="Arial"/>
@@ -2294,7 +2038,6 @@
                               </w:rPr>
                               <w:t>rag</w:t>
                             </w:r>
-                            <w:proofErr w:type="spellEnd"/>
                           </w:p>
                         </w:txbxContent>
                       </v:textbox>
@@ -2363,7 +2106,6 @@
                                       <w:szCs w:val="10"/>
                                     </w:rPr>
                                   </w:pPr>
-                                  <w:proofErr w:type="spellStart"/>
                                   <w:r>
                                     <w:rPr>
                                       <w:rFonts w:ascii="Arial" w:hAnsi="Arial" w:cs="Arial"/>
@@ -2373,33 +2115,8 @@
                                       <w:sz w:val="10"/>
                                       <w:szCs w:val="10"/>
                                     </w:rPr>
-                                    <w:t>Niet</w:t>
+                                    <w:t>Niet geleegd</w:t>
                                   </w:r>
-                                  <w:proofErr w:type="spellEnd"/>
-                                  <w:r>
-                                    <w:rPr>
-                                      <w:rFonts w:ascii="Arial" w:hAnsi="Arial" w:cs="Arial"/>
-                                      <w:b/>
-                                      <w:bCs/>
-                                      <w:color w:val="FFFFFF" w:themeColor="background1"/>
-                                      <w:sz w:val="10"/>
-                                      <w:szCs w:val="10"/>
-                                    </w:rPr>
-                                    <w:t xml:space="preserve"> </w:t>
-                                  </w:r>
-                                  <w:proofErr w:type="spellStart"/>
-                                  <w:r>
-                                    <w:rPr>
-                                      <w:rFonts w:ascii="Arial" w:hAnsi="Arial" w:cs="Arial"/>
-                                      <w:b/>
-                                      <w:bCs/>
-                                      <w:color w:val="FFFFFF" w:themeColor="background1"/>
-                                      <w:sz w:val="10"/>
-                                      <w:szCs w:val="10"/>
-                                    </w:rPr>
-                                    <w:t>geleegd</w:t>
-                                  </w:r>
-                                  <w:proofErr w:type="spellEnd"/>
                                 </w:p>
                               </w:txbxContent>
                             </wps:txbx>
@@ -2439,7 +2156,6 @@
                                 <w:szCs w:val="10"/>
                               </w:rPr>
                             </w:pPr>
-                            <w:proofErr w:type="spellStart"/>
                             <w:r>
                               <w:rPr>
                                 <w:rFonts w:ascii="Arial" w:hAnsi="Arial" w:cs="Arial"/>
@@ -2449,33 +2165,8 @@
                                 <w:sz w:val="10"/>
                                 <w:szCs w:val="10"/>
                               </w:rPr>
-                              <w:t>Niet</w:t>
+                              <w:t>Niet geleegd</w:t>
                             </w:r>
-                            <w:proofErr w:type="spellEnd"/>
-                            <w:r>
-                              <w:rPr>
-                                <w:rFonts w:ascii="Arial" w:hAnsi="Arial" w:cs="Arial"/>
-                                <w:b/>
-                                <w:bCs/>
-                                <w:color w:val="FFFFFF" w:themeColor="background1"/>
-                                <w:sz w:val="10"/>
-                                <w:szCs w:val="10"/>
-                              </w:rPr>
-                              <w:t xml:space="preserve"> </w:t>
-                            </w:r>
-                            <w:proofErr w:type="spellStart"/>
-                            <w:r>
-                              <w:rPr>
-                                <w:rFonts w:ascii="Arial" w:hAnsi="Arial" w:cs="Arial"/>
-                                <w:b/>
-                                <w:bCs/>
-                                <w:color w:val="FFFFFF" w:themeColor="background1"/>
-                                <w:sz w:val="10"/>
-                                <w:szCs w:val="10"/>
-                              </w:rPr>
-                              <w:t>geleegd</w:t>
-                            </w:r>
-                            <w:proofErr w:type="spellEnd"/>
                           </w:p>
                         </w:txbxContent>
                       </v:textbox>
@@ -2544,7 +2235,6 @@
                                       <w:szCs w:val="10"/>
                                     </w:rPr>
                                   </w:pPr>
-                                  <w:proofErr w:type="spellStart"/>
                                   <w:r>
                                     <w:rPr>
                                       <w:rFonts w:ascii="Arial" w:hAnsi="Arial" w:cs="Arial"/>
@@ -2556,7 +2246,6 @@
                                     </w:rPr>
                                     <w:t>Aanslag</w:t>
                                   </w:r>
-                                  <w:proofErr w:type="spellEnd"/>
                                 </w:p>
                               </w:txbxContent>
                             </wps:txbx>
@@ -2596,7 +2285,6 @@
                                 <w:szCs w:val="10"/>
                               </w:rPr>
                             </w:pPr>
-                            <w:proofErr w:type="spellStart"/>
                             <w:r>
                               <w:rPr>
                                 <w:rFonts w:ascii="Arial" w:hAnsi="Arial" w:cs="Arial"/>
@@ -2608,7 +2296,6 @@
                               </w:rPr>
                               <w:t>Aanslag</w:t>
                             </w:r>
-                            <w:proofErr w:type="spellEnd"/>
                           </w:p>
                         </w:txbxContent>
                       </v:textbox>
@@ -2676,7 +2363,6 @@
                                       <w:szCs w:val="10"/>
                                     </w:rPr>
                                   </w:pPr>
-                                  <w:proofErr w:type="spellStart"/>
                                   <w:r>
                                     <w:rPr>
                                       <w:rFonts w:ascii="Arial" w:hAnsi="Arial" w:cs="Arial"/>
@@ -2686,105 +2372,8 @@
                                       <w:sz w:val="10"/>
                                       <w:szCs w:val="10"/>
                                     </w:rPr>
-                                    <w:t>Niet</w:t>
+                                    <w:t>Niet gehecht vuil licht stof</w:t>
                                   </w:r>
-                                  <w:proofErr w:type="spellEnd"/>
-                                  <w:r>
-                                    <w:rPr>
-                                      <w:rFonts w:ascii="Arial" w:hAnsi="Arial" w:cs="Arial"/>
-                                      <w:b/>
-                                      <w:bCs/>
-                                      <w:color w:val="FFFFFF" w:themeColor="background1"/>
-                                      <w:sz w:val="10"/>
-                                      <w:szCs w:val="10"/>
-                                    </w:rPr>
-                                    <w:t xml:space="preserve"> </w:t>
-                                  </w:r>
-                                  <w:proofErr w:type="spellStart"/>
-                                  <w:r>
-                                    <w:rPr>
-                                      <w:rFonts w:ascii="Arial" w:hAnsi="Arial" w:cs="Arial"/>
-                                      <w:b/>
-                                      <w:bCs/>
-                                      <w:color w:val="FFFFFF" w:themeColor="background1"/>
-                                      <w:sz w:val="10"/>
-                                      <w:szCs w:val="10"/>
-                                    </w:rPr>
-                                    <w:t>gehecht</w:t>
-                                  </w:r>
-                                  <w:proofErr w:type="spellEnd"/>
-                                  <w:r>
-                                    <w:rPr>
-                                      <w:rFonts w:ascii="Arial" w:hAnsi="Arial" w:cs="Arial"/>
-                                      <w:b/>
-                                      <w:bCs/>
-                                      <w:color w:val="FFFFFF" w:themeColor="background1"/>
-                                      <w:sz w:val="10"/>
-                                      <w:szCs w:val="10"/>
-                                    </w:rPr>
-                                    <w:t xml:space="preserve"> </w:t>
-                                  </w:r>
-                                  <w:proofErr w:type="spellStart"/>
-                                  <w:r>
-                                    <w:rPr>
-                                      <w:rFonts w:ascii="Arial" w:hAnsi="Arial" w:cs="Arial"/>
-                                      <w:b/>
-                                      <w:bCs/>
-                                      <w:color w:val="FFFFFF" w:themeColor="background1"/>
-                                      <w:sz w:val="10"/>
-                                      <w:szCs w:val="10"/>
-                                    </w:rPr>
-                                    <w:t>vuil</w:t>
-                                  </w:r>
-                                  <w:proofErr w:type="spellEnd"/>
-                                  <w:r>
-                                    <w:rPr>
-                                      <w:rFonts w:ascii="Arial" w:hAnsi="Arial" w:cs="Arial"/>
-                                      <w:b/>
-                                      <w:bCs/>
-                                      <w:color w:val="FFFFFF" w:themeColor="background1"/>
-                                      <w:sz w:val="10"/>
-                                      <w:szCs w:val="10"/>
-                                    </w:rPr>
-                                    <w:t xml:space="preserve"> </w:t>
-                                  </w:r>
-                                  <w:proofErr w:type="spellStart"/>
-                                  <w:r>
-                                    <w:rPr>
-                                      <w:rFonts w:ascii="Arial" w:hAnsi="Arial" w:cs="Arial"/>
-                                      <w:b/>
-                                      <w:bCs/>
-                                      <w:color w:val="FFFFFF" w:themeColor="background1"/>
-                                      <w:sz w:val="10"/>
-                                      <w:szCs w:val="10"/>
-                                    </w:rPr>
-                                    <w:t>licht</w:t>
-                                  </w:r>
-                                  <w:proofErr w:type="spellEnd"/>
-                                  <w:r>
-                                    <w:rPr>
-                                      <w:rFonts w:ascii="Arial" w:hAnsi="Arial" w:cs="Arial"/>
-                                      <w:b/>
-                                      <w:bCs/>
-                                      <w:color w:val="FFFFFF" w:themeColor="background1"/>
-                                      <w:sz w:val="10"/>
-                                      <w:szCs w:val="10"/>
-                                    </w:rPr>
-                                    <w:t xml:space="preserve"> </w:t>
-                                  </w:r>
-                                  <w:proofErr w:type="spellStart"/>
-                                  <w:r>
-                                    <w:rPr>
-                                      <w:rFonts w:ascii="Arial" w:hAnsi="Arial" w:cs="Arial"/>
-                                      <w:b/>
-                                      <w:bCs/>
-                                      <w:color w:val="FFFFFF" w:themeColor="background1"/>
-                                      <w:sz w:val="10"/>
-                                      <w:szCs w:val="10"/>
-                                    </w:rPr>
-                                    <w:t>stof</w:t>
-                                  </w:r>
-                                  <w:proofErr w:type="spellEnd"/>
                                 </w:p>
                               </w:txbxContent>
                             </wps:txbx>
@@ -2823,7 +2412,6 @@
                                 <w:szCs w:val="10"/>
                               </w:rPr>
                             </w:pPr>
-                            <w:proofErr w:type="spellStart"/>
                             <w:r>
                               <w:rPr>
                                 <w:rFonts w:ascii="Arial" w:hAnsi="Arial" w:cs="Arial"/>
@@ -2833,105 +2421,8 @@
                                 <w:sz w:val="10"/>
                                 <w:szCs w:val="10"/>
                               </w:rPr>
-                              <w:t>Niet</w:t>
+                              <w:t>Niet gehecht vuil licht stof</w:t>
                             </w:r>
-                            <w:proofErr w:type="spellEnd"/>
-                            <w:r>
-                              <w:rPr>
-                                <w:rFonts w:ascii="Arial" w:hAnsi="Arial" w:cs="Arial"/>
-                                <w:b/>
-                                <w:bCs/>
-                                <w:color w:val="FFFFFF" w:themeColor="background1"/>
-                                <w:sz w:val="10"/>
-                                <w:szCs w:val="10"/>
-                              </w:rPr>
-                              <w:t xml:space="preserve"> </w:t>
-                            </w:r>
-                            <w:proofErr w:type="spellStart"/>
-                            <w:r>
-                              <w:rPr>
-                                <w:rFonts w:ascii="Arial" w:hAnsi="Arial" w:cs="Arial"/>
-                                <w:b/>
-                                <w:bCs/>
-                                <w:color w:val="FFFFFF" w:themeColor="background1"/>
-                                <w:sz w:val="10"/>
-                                <w:szCs w:val="10"/>
-                              </w:rPr>
-                              <w:t>gehecht</w:t>
-                            </w:r>
-                            <w:proofErr w:type="spellEnd"/>
-                            <w:r>
-                              <w:rPr>
-                                <w:rFonts w:ascii="Arial" w:hAnsi="Arial" w:cs="Arial"/>
-                                <w:b/>
-                                <w:bCs/>
-                                <w:color w:val="FFFFFF" w:themeColor="background1"/>
-                                <w:sz w:val="10"/>
-                                <w:szCs w:val="10"/>
-                              </w:rPr>
-                              <w:t xml:space="preserve"> </w:t>
-                            </w:r>
-                            <w:proofErr w:type="spellStart"/>
-                            <w:r>
-                              <w:rPr>
-                                <w:rFonts w:ascii="Arial" w:hAnsi="Arial" w:cs="Arial"/>
-                                <w:b/>
-                                <w:bCs/>
-                                <w:color w:val="FFFFFF" w:themeColor="background1"/>
-                                <w:sz w:val="10"/>
-                                <w:szCs w:val="10"/>
-                              </w:rPr>
-                              <w:t>vuil</w:t>
-                            </w:r>
-                            <w:proofErr w:type="spellEnd"/>
-                            <w:r>
-                              <w:rPr>
-                                <w:rFonts w:ascii="Arial" w:hAnsi="Arial" w:cs="Arial"/>
-                                <w:b/>
-                                <w:bCs/>
-                                <w:color w:val="FFFFFF" w:themeColor="background1"/>
-                                <w:sz w:val="10"/>
-                                <w:szCs w:val="10"/>
-                              </w:rPr>
-                              <w:t xml:space="preserve"> </w:t>
-                            </w:r>
-                            <w:proofErr w:type="spellStart"/>
-                            <w:r>
-                              <w:rPr>
-                                <w:rFonts w:ascii="Arial" w:hAnsi="Arial" w:cs="Arial"/>
-                                <w:b/>
-                                <w:bCs/>
-                                <w:color w:val="FFFFFF" w:themeColor="background1"/>
-                                <w:sz w:val="10"/>
-                                <w:szCs w:val="10"/>
-                              </w:rPr>
-                              <w:t>licht</w:t>
-                            </w:r>
-                            <w:proofErr w:type="spellEnd"/>
-                            <w:r>
-                              <w:rPr>
-                                <w:rFonts w:ascii="Arial" w:hAnsi="Arial" w:cs="Arial"/>
-                                <w:b/>
-                                <w:bCs/>
-                                <w:color w:val="FFFFFF" w:themeColor="background1"/>
-                                <w:sz w:val="10"/>
-                                <w:szCs w:val="10"/>
-                              </w:rPr>
-                              <w:t xml:space="preserve"> </w:t>
-                            </w:r>
-                            <w:proofErr w:type="spellStart"/>
-                            <w:r>
-                              <w:rPr>
-                                <w:rFonts w:ascii="Arial" w:hAnsi="Arial" w:cs="Arial"/>
-                                <w:b/>
-                                <w:bCs/>
-                                <w:color w:val="FFFFFF" w:themeColor="background1"/>
-                                <w:sz w:val="10"/>
-                                <w:szCs w:val="10"/>
-                              </w:rPr>
-                              <w:t>stof</w:t>
-                            </w:r>
-                            <w:proofErr w:type="spellEnd"/>
                           </w:p>
                         </w:txbxContent>
                       </v:textbox>
@@ -3000,7 +2491,6 @@
                                       <w:szCs w:val="10"/>
                                     </w:rPr>
                                   </w:pPr>
-                                  <w:proofErr w:type="spellStart"/>
                                   <w:r>
                                     <w:rPr>
                                       <w:rFonts w:ascii="Arial" w:hAnsi="Arial" w:cs="Arial"/>
@@ -3010,79 +2500,7 @@
                                       <w:sz w:val="10"/>
                                       <w:szCs w:val="10"/>
                                     </w:rPr>
-                                    <w:t>Niet</w:t>
-                                  </w:r>
-                                  <w:proofErr w:type="spellEnd"/>
-                                  <w:r>
-                                    <w:rPr>
-                                      <w:rFonts w:ascii="Arial" w:hAnsi="Arial" w:cs="Arial"/>
-                                      <w:b/>
-                                      <w:bCs/>
-                                      <w:color w:val="FFFFFF" w:themeColor="background1"/>
-                                      <w:sz w:val="10"/>
-                                      <w:szCs w:val="10"/>
-                                    </w:rPr>
-                                    <w:t xml:space="preserve"> </w:t>
-                                  </w:r>
-                                  <w:proofErr w:type="spellStart"/>
-                                  <w:r>
-                                    <w:rPr>
-                                      <w:rFonts w:ascii="Arial" w:hAnsi="Arial" w:cs="Arial"/>
-                                      <w:b/>
-                                      <w:bCs/>
-                                      <w:color w:val="FFFFFF" w:themeColor="background1"/>
-                                      <w:sz w:val="10"/>
-                                      <w:szCs w:val="10"/>
-                                    </w:rPr>
-                                    <w:t>gehecht</w:t>
-                                  </w:r>
-                                  <w:proofErr w:type="spellEnd"/>
-                                  <w:r>
-                                    <w:rPr>
-                                      <w:rFonts w:ascii="Arial" w:hAnsi="Arial" w:cs="Arial"/>
-                                      <w:b/>
-                                      <w:bCs/>
-                                      <w:color w:val="FFFFFF" w:themeColor="background1"/>
-                                      <w:sz w:val="10"/>
-                                      <w:szCs w:val="10"/>
-                                    </w:rPr>
-                                    <w:t xml:space="preserve"> </w:t>
-                                  </w:r>
-                                  <w:proofErr w:type="spellStart"/>
-                                  <w:r>
-                                    <w:rPr>
-                                      <w:rFonts w:ascii="Arial" w:hAnsi="Arial" w:cs="Arial"/>
-                                      <w:b/>
-                                      <w:bCs/>
-                                      <w:color w:val="FFFFFF" w:themeColor="background1"/>
-                                      <w:sz w:val="10"/>
-                                      <w:szCs w:val="10"/>
-                                    </w:rPr>
-                                    <w:t>vuil</w:t>
-                                  </w:r>
-                                  <w:proofErr w:type="spellEnd"/>
-                                  <w:r>
-                                    <w:rPr>
-                                      <w:rFonts w:ascii="Arial" w:hAnsi="Arial" w:cs="Arial"/>
-                                      <w:b/>
-                                      <w:bCs/>
-                                      <w:color w:val="FFFFFF" w:themeColor="background1"/>
-                                      <w:sz w:val="10"/>
-                                      <w:szCs w:val="10"/>
-                                    </w:rPr>
-                                    <w:t xml:space="preserve"> </w:t>
-                                  </w:r>
-                                  <w:proofErr w:type="spellStart"/>
-                                  <w:r>
-                                    <w:rPr>
-                                      <w:rFonts w:ascii="Arial" w:hAnsi="Arial" w:cs="Arial"/>
-                                      <w:b/>
-                                      <w:bCs/>
-                                      <w:color w:val="FFFFFF" w:themeColor="background1"/>
-                                      <w:sz w:val="10"/>
-                                      <w:szCs w:val="10"/>
-                                    </w:rPr>
-                                    <w:t>meth</w:t>
+                                    <w:t>Niet gehecht vuil meth</w:t>
                                   </w:r>
                                   <w:r>
                                     <w:rPr>
@@ -3106,7 +2524,6 @@
                                     </w:rPr>
                                     <w:t>de</w:t>
                                   </w:r>
-                                  <w:proofErr w:type="spellEnd"/>
                                 </w:p>
                               </w:txbxContent>
                             </wps:txbx>
@@ -3146,7 +2563,6 @@
                                 <w:szCs w:val="10"/>
                               </w:rPr>
                             </w:pPr>
-                            <w:proofErr w:type="spellStart"/>
                             <w:r>
                               <w:rPr>
                                 <w:rFonts w:ascii="Arial" w:hAnsi="Arial" w:cs="Arial"/>
@@ -3156,79 +2572,7 @@
                                 <w:sz w:val="10"/>
                                 <w:szCs w:val="10"/>
                               </w:rPr>
-                              <w:t>Niet</w:t>
-                            </w:r>
-                            <w:proofErr w:type="spellEnd"/>
-                            <w:r>
-                              <w:rPr>
-                                <w:rFonts w:ascii="Arial" w:hAnsi="Arial" w:cs="Arial"/>
-                                <w:b/>
-                                <w:bCs/>
-                                <w:color w:val="FFFFFF" w:themeColor="background1"/>
-                                <w:sz w:val="10"/>
-                                <w:szCs w:val="10"/>
-                              </w:rPr>
-                              <w:t xml:space="preserve"> </w:t>
-                            </w:r>
-                            <w:proofErr w:type="spellStart"/>
-                            <w:r>
-                              <w:rPr>
-                                <w:rFonts w:ascii="Arial" w:hAnsi="Arial" w:cs="Arial"/>
-                                <w:b/>
-                                <w:bCs/>
-                                <w:color w:val="FFFFFF" w:themeColor="background1"/>
-                                <w:sz w:val="10"/>
-                                <w:szCs w:val="10"/>
-                              </w:rPr>
-                              <w:t>gehecht</w:t>
-                            </w:r>
-                            <w:proofErr w:type="spellEnd"/>
-                            <w:r>
-                              <w:rPr>
-                                <w:rFonts w:ascii="Arial" w:hAnsi="Arial" w:cs="Arial"/>
-                                <w:b/>
-                                <w:bCs/>
-                                <w:color w:val="FFFFFF" w:themeColor="background1"/>
-                                <w:sz w:val="10"/>
-                                <w:szCs w:val="10"/>
-                              </w:rPr>
-                              <w:t xml:space="preserve"> </w:t>
-                            </w:r>
-                            <w:proofErr w:type="spellStart"/>
-                            <w:r>
-                              <w:rPr>
-                                <w:rFonts w:ascii="Arial" w:hAnsi="Arial" w:cs="Arial"/>
-                                <w:b/>
-                                <w:bCs/>
-                                <w:color w:val="FFFFFF" w:themeColor="background1"/>
-                                <w:sz w:val="10"/>
-                                <w:szCs w:val="10"/>
-                              </w:rPr>
-                              <w:t>vuil</w:t>
-                            </w:r>
-                            <w:proofErr w:type="spellEnd"/>
-                            <w:r>
-                              <w:rPr>
-                                <w:rFonts w:ascii="Arial" w:hAnsi="Arial" w:cs="Arial"/>
-                                <w:b/>
-                                <w:bCs/>
-                                <w:color w:val="FFFFFF" w:themeColor="background1"/>
-                                <w:sz w:val="10"/>
-                                <w:szCs w:val="10"/>
-                              </w:rPr>
-                              <w:t xml:space="preserve"> </w:t>
-                            </w:r>
-                            <w:proofErr w:type="spellStart"/>
-                            <w:r>
-                              <w:rPr>
-                                <w:rFonts w:ascii="Arial" w:hAnsi="Arial" w:cs="Arial"/>
-                                <w:b/>
-                                <w:bCs/>
-                                <w:color w:val="FFFFFF" w:themeColor="background1"/>
-                                <w:sz w:val="10"/>
-                                <w:szCs w:val="10"/>
-                              </w:rPr>
-                              <w:t>meth</w:t>
+                              <w:t>Niet gehecht vuil meth</w:t>
                             </w:r>
                             <w:r>
                               <w:rPr>
@@ -3252,7 +2596,6 @@
                               </w:rPr>
                               <w:t>de</w:t>
                             </w:r>
-                            <w:proofErr w:type="spellEnd"/>
                           </w:p>
                         </w:txbxContent>
                       </v:textbox>
@@ -3321,7 +2664,6 @@
                                       <w:szCs w:val="10"/>
                                     </w:rPr>
                                   </w:pPr>
-                                  <w:proofErr w:type="spellStart"/>
                                   <w:r>
                                     <w:rPr>
                                       <w:rFonts w:ascii="Arial" w:hAnsi="Arial" w:cs="Arial"/>
@@ -3331,33 +2673,8 @@
                                       <w:sz w:val="10"/>
                                       <w:szCs w:val="10"/>
                                     </w:rPr>
-                                    <w:t>Niet</w:t>
+                                    <w:t>Niet aangevuld</w:t>
                                   </w:r>
-                                  <w:proofErr w:type="spellEnd"/>
-                                  <w:r>
-                                    <w:rPr>
-                                      <w:rFonts w:ascii="Arial" w:hAnsi="Arial" w:cs="Arial"/>
-                                      <w:b/>
-                                      <w:bCs/>
-                                      <w:color w:val="FFFFFF" w:themeColor="background1"/>
-                                      <w:sz w:val="10"/>
-                                      <w:szCs w:val="10"/>
-                                    </w:rPr>
-                                    <w:t xml:space="preserve"> </w:t>
-                                  </w:r>
-                                  <w:proofErr w:type="spellStart"/>
-                                  <w:r>
-                                    <w:rPr>
-                                      <w:rFonts w:ascii="Arial" w:hAnsi="Arial" w:cs="Arial"/>
-                                      <w:b/>
-                                      <w:bCs/>
-                                      <w:color w:val="FFFFFF" w:themeColor="background1"/>
-                                      <w:sz w:val="10"/>
-                                      <w:szCs w:val="10"/>
-                                    </w:rPr>
-                                    <w:t>aangevuld</w:t>
-                                  </w:r>
-                                  <w:proofErr w:type="spellEnd"/>
                                 </w:p>
                               </w:txbxContent>
                             </wps:txbx>
@@ -3397,7 +2714,6 @@
                                 <w:szCs w:val="10"/>
                               </w:rPr>
                             </w:pPr>
-                            <w:proofErr w:type="spellStart"/>
                             <w:r>
                               <w:rPr>
                                 <w:rFonts w:ascii="Arial" w:hAnsi="Arial" w:cs="Arial"/>
@@ -3407,33 +2723,8 @@
                                 <w:sz w:val="10"/>
                                 <w:szCs w:val="10"/>
                               </w:rPr>
-                              <w:t>Niet</w:t>
+                              <w:t>Niet aangevuld</w:t>
                             </w:r>
-                            <w:proofErr w:type="spellEnd"/>
-                            <w:r>
-                              <w:rPr>
-                                <w:rFonts w:ascii="Arial" w:hAnsi="Arial" w:cs="Arial"/>
-                                <w:b/>
-                                <w:bCs/>
-                                <w:color w:val="FFFFFF" w:themeColor="background1"/>
-                                <w:sz w:val="10"/>
-                                <w:szCs w:val="10"/>
-                              </w:rPr>
-                              <w:t xml:space="preserve"> </w:t>
-                            </w:r>
-                            <w:proofErr w:type="spellStart"/>
-                            <w:r>
-                              <w:rPr>
-                                <w:rFonts w:ascii="Arial" w:hAnsi="Arial" w:cs="Arial"/>
-                                <w:b/>
-                                <w:bCs/>
-                                <w:color w:val="FFFFFF" w:themeColor="background1"/>
-                                <w:sz w:val="10"/>
-                                <w:szCs w:val="10"/>
-                              </w:rPr>
-                              <w:t>aangevuld</w:t>
-                            </w:r>
-                            <w:proofErr w:type="spellEnd"/>
                           </w:p>
                         </w:txbxContent>
                       </v:textbox>
@@ -3502,7 +2793,6 @@
                                       <w:szCs w:val="10"/>
                                     </w:rPr>
                                   </w:pPr>
-                                  <w:proofErr w:type="spellStart"/>
                                   <w:r>
                                     <w:rPr>
                                       <w:rFonts w:ascii="Arial" w:hAnsi="Arial" w:cs="Arial"/>
@@ -3512,81 +2802,8 @@
                                       <w:sz w:val="10"/>
                                       <w:szCs w:val="10"/>
                                     </w:rPr>
-                                    <w:t>Gehecht</w:t>
+                                    <w:t>Gehecht vuil vlek vingertast</w:t>
                                   </w:r>
-                                  <w:proofErr w:type="spellEnd"/>
-                                  <w:r>
-                                    <w:rPr>
-                                      <w:rFonts w:ascii="Arial" w:hAnsi="Arial" w:cs="Arial"/>
-                                      <w:b/>
-                                      <w:bCs/>
-                                      <w:color w:val="FFFFFF" w:themeColor="background1"/>
-                                      <w:sz w:val="10"/>
-                                      <w:szCs w:val="10"/>
-                                    </w:rPr>
-                                    <w:t xml:space="preserve"> </w:t>
-                                  </w:r>
-                                  <w:proofErr w:type="spellStart"/>
-                                  <w:r>
-                                    <w:rPr>
-                                      <w:rFonts w:ascii="Arial" w:hAnsi="Arial" w:cs="Arial"/>
-                                      <w:b/>
-                                      <w:bCs/>
-                                      <w:color w:val="FFFFFF" w:themeColor="background1"/>
-                                      <w:sz w:val="10"/>
-                                      <w:szCs w:val="10"/>
-                                    </w:rPr>
-                                    <w:t>vuil</w:t>
-                                  </w:r>
-                                  <w:proofErr w:type="spellEnd"/>
-                                  <w:r>
-                                    <w:rPr>
-                                      <w:rFonts w:ascii="Arial" w:hAnsi="Arial" w:cs="Arial"/>
-                                      <w:b/>
-                                      <w:bCs/>
-                                      <w:color w:val="FFFFFF" w:themeColor="background1"/>
-                                      <w:sz w:val="10"/>
-                                      <w:szCs w:val="10"/>
-                                    </w:rPr>
-                                    <w:t xml:space="preserve"> </w:t>
-                                  </w:r>
-                                  <w:proofErr w:type="spellStart"/>
-                                  <w:r>
-                                    <w:rPr>
-                                      <w:rFonts w:ascii="Arial" w:hAnsi="Arial" w:cs="Arial"/>
-                                      <w:b/>
-                                      <w:bCs/>
-                                      <w:color w:val="FFFFFF" w:themeColor="background1"/>
-                                      <w:sz w:val="10"/>
-                                      <w:szCs w:val="10"/>
-                                    </w:rPr>
-                                    <w:t>vlek</w:t>
-                                  </w:r>
-                                  <w:proofErr w:type="spellEnd"/>
-                                  <w:r>
-                                    <w:rPr>
-                                      <w:rFonts w:ascii="Arial" w:hAnsi="Arial" w:cs="Arial"/>
-                                      <w:b/>
-                                      <w:bCs/>
-                                      <w:color w:val="FFFFFF" w:themeColor="background1"/>
-                                      <w:sz w:val="10"/>
-                                      <w:szCs w:val="10"/>
-                                    </w:rPr>
-                                    <w:t xml:space="preserve"> </w:t>
-                                  </w:r>
-                                  <w:proofErr w:type="spellStart"/>
-                                  <w:r>
-                                    <w:rPr>
-                                      <w:rFonts w:ascii="Arial" w:hAnsi="Arial" w:cs="Arial"/>
-                                      <w:b/>
-                                      <w:bCs/>
-                                      <w:color w:val="FFFFFF" w:themeColor="background1"/>
-                                      <w:sz w:val="10"/>
-                                      <w:szCs w:val="10"/>
-                                    </w:rPr>
-                                    <w:t>vingertast</w:t>
-                                  </w:r>
-                                  <w:proofErr w:type="spellEnd"/>
                                 </w:p>
                               </w:txbxContent>
                             </wps:txbx>
@@ -3626,7 +2843,6 @@
                                 <w:szCs w:val="10"/>
                               </w:rPr>
                             </w:pPr>
-                            <w:proofErr w:type="spellStart"/>
                             <w:r>
                               <w:rPr>
                                 <w:rFonts w:ascii="Arial" w:hAnsi="Arial" w:cs="Arial"/>
@@ -3636,81 +2852,8 @@
                                 <w:sz w:val="10"/>
                                 <w:szCs w:val="10"/>
                               </w:rPr>
-                              <w:t>Gehecht</w:t>
+                              <w:t>Gehecht vuil vlek vingertast</w:t>
                             </w:r>
-                            <w:proofErr w:type="spellEnd"/>
-                            <w:r>
-                              <w:rPr>
-                                <w:rFonts w:ascii="Arial" w:hAnsi="Arial" w:cs="Arial"/>
-                                <w:b/>
-                                <w:bCs/>
-                                <w:color w:val="FFFFFF" w:themeColor="background1"/>
-                                <w:sz w:val="10"/>
-                                <w:szCs w:val="10"/>
-                              </w:rPr>
-                              <w:t xml:space="preserve"> </w:t>
-                            </w:r>
-                            <w:proofErr w:type="spellStart"/>
-                            <w:r>
-                              <w:rPr>
-                                <w:rFonts w:ascii="Arial" w:hAnsi="Arial" w:cs="Arial"/>
-                                <w:b/>
-                                <w:bCs/>
-                                <w:color w:val="FFFFFF" w:themeColor="background1"/>
-                                <w:sz w:val="10"/>
-                                <w:szCs w:val="10"/>
-                              </w:rPr>
-                              <w:t>vuil</w:t>
-                            </w:r>
-                            <w:proofErr w:type="spellEnd"/>
-                            <w:r>
-                              <w:rPr>
-                                <w:rFonts w:ascii="Arial" w:hAnsi="Arial" w:cs="Arial"/>
-                                <w:b/>
-                                <w:bCs/>
-                                <w:color w:val="FFFFFF" w:themeColor="background1"/>
-                                <w:sz w:val="10"/>
-                                <w:szCs w:val="10"/>
-                              </w:rPr>
-                              <w:t xml:space="preserve"> </w:t>
-                            </w:r>
-                            <w:proofErr w:type="spellStart"/>
-                            <w:r>
-                              <w:rPr>
-                                <w:rFonts w:ascii="Arial" w:hAnsi="Arial" w:cs="Arial"/>
-                                <w:b/>
-                                <w:bCs/>
-                                <w:color w:val="FFFFFF" w:themeColor="background1"/>
-                                <w:sz w:val="10"/>
-                                <w:szCs w:val="10"/>
-                              </w:rPr>
-                              <w:t>vlek</w:t>
-                            </w:r>
-                            <w:proofErr w:type="spellEnd"/>
-                            <w:r>
-                              <w:rPr>
-                                <w:rFonts w:ascii="Arial" w:hAnsi="Arial" w:cs="Arial"/>
-                                <w:b/>
-                                <w:bCs/>
-                                <w:color w:val="FFFFFF" w:themeColor="background1"/>
-                                <w:sz w:val="10"/>
-                                <w:szCs w:val="10"/>
-                              </w:rPr>
-                              <w:t xml:space="preserve"> </w:t>
-                            </w:r>
-                            <w:proofErr w:type="spellStart"/>
-                            <w:r>
-                              <w:rPr>
-                                <w:rFonts w:ascii="Arial" w:hAnsi="Arial" w:cs="Arial"/>
-                                <w:b/>
-                                <w:bCs/>
-                                <w:color w:val="FFFFFF" w:themeColor="background1"/>
-                                <w:sz w:val="10"/>
-                                <w:szCs w:val="10"/>
-                              </w:rPr>
-                              <w:t>vingertast</w:t>
-                            </w:r>
-                            <w:proofErr w:type="spellEnd"/>
                           </w:p>
                         </w:txbxContent>
                       </v:textbox>
@@ -3779,7 +2922,6 @@
                                       <w:szCs w:val="10"/>
                                     </w:rPr>
                                   </w:pPr>
-                                  <w:proofErr w:type="spellStart"/>
                                   <w:r>
                                     <w:rPr>
                                       <w:rFonts w:ascii="Arial" w:hAnsi="Arial" w:cs="Arial"/>
@@ -3789,57 +2931,8 @@
                                       <w:sz w:val="10"/>
                                       <w:szCs w:val="10"/>
                                     </w:rPr>
-                                    <w:t>Gehecht</w:t>
+                                    <w:t>Gehecht vuil methode</w:t>
                                   </w:r>
-                                  <w:proofErr w:type="spellEnd"/>
-                                  <w:r>
-                                    <w:rPr>
-                                      <w:rFonts w:ascii="Arial" w:hAnsi="Arial" w:cs="Arial"/>
-                                      <w:b/>
-                                      <w:bCs/>
-                                      <w:color w:val="FFFFFF" w:themeColor="background1"/>
-                                      <w:sz w:val="10"/>
-                                      <w:szCs w:val="10"/>
-                                    </w:rPr>
-                                    <w:t xml:space="preserve"> </w:t>
-                                  </w:r>
-                                  <w:proofErr w:type="spellStart"/>
-                                  <w:r>
-                                    <w:rPr>
-                                      <w:rFonts w:ascii="Arial" w:hAnsi="Arial" w:cs="Arial"/>
-                                      <w:b/>
-                                      <w:bCs/>
-                                      <w:color w:val="FFFFFF" w:themeColor="background1"/>
-                                      <w:sz w:val="10"/>
-                                      <w:szCs w:val="10"/>
-                                    </w:rPr>
-                                    <w:t>vuil</w:t>
-                                  </w:r>
-                                  <w:proofErr w:type="spellEnd"/>
-                                  <w:r>
-                                    <w:rPr>
-                                      <w:rFonts w:ascii="Arial" w:hAnsi="Arial" w:cs="Arial"/>
-                                      <w:b/>
-                                      <w:bCs/>
-                                      <w:color w:val="FFFFFF" w:themeColor="background1"/>
-                                      <w:sz w:val="10"/>
-                                      <w:szCs w:val="10"/>
-                                    </w:rPr>
-                                    <w:t xml:space="preserve"> </w:t>
-                                  </w:r>
-                                  <w:proofErr w:type="spellStart"/>
-                                  <w:r>
-                                    <w:rPr>
-                                      <w:rFonts w:ascii="Arial" w:hAnsi="Arial" w:cs="Arial"/>
-                                      <w:b/>
-                                      <w:bCs/>
-                                      <w:color w:val="FFFFFF" w:themeColor="background1"/>
-                                      <w:sz w:val="10"/>
-                                      <w:szCs w:val="10"/>
-                                    </w:rPr>
-                                    <w:t>methode</w:t>
-                                  </w:r>
-                                  <w:proofErr w:type="spellEnd"/>
                                 </w:p>
                               </w:txbxContent>
                             </wps:txbx>
@@ -3879,7 +2972,6 @@
                                 <w:szCs w:val="10"/>
                               </w:rPr>
                             </w:pPr>
-                            <w:proofErr w:type="spellStart"/>
                             <w:r>
                               <w:rPr>
                                 <w:rFonts w:ascii="Arial" w:hAnsi="Arial" w:cs="Arial"/>
@@ -3889,57 +2981,8 @@
                                 <w:sz w:val="10"/>
                                 <w:szCs w:val="10"/>
                               </w:rPr>
-                              <w:t>Gehecht</w:t>
+                              <w:t>Gehecht vuil methode</w:t>
                             </w:r>
-                            <w:proofErr w:type="spellEnd"/>
-                            <w:r>
-                              <w:rPr>
-                                <w:rFonts w:ascii="Arial" w:hAnsi="Arial" w:cs="Arial"/>
-                                <w:b/>
-                                <w:bCs/>
-                                <w:color w:val="FFFFFF" w:themeColor="background1"/>
-                                <w:sz w:val="10"/>
-                                <w:szCs w:val="10"/>
-                              </w:rPr>
-                              <w:t xml:space="preserve"> </w:t>
-                            </w:r>
-                            <w:proofErr w:type="spellStart"/>
-                            <w:r>
-                              <w:rPr>
-                                <w:rFonts w:ascii="Arial" w:hAnsi="Arial" w:cs="Arial"/>
-                                <w:b/>
-                                <w:bCs/>
-                                <w:color w:val="FFFFFF" w:themeColor="background1"/>
-                                <w:sz w:val="10"/>
-                                <w:szCs w:val="10"/>
-                              </w:rPr>
-                              <w:t>vuil</w:t>
-                            </w:r>
-                            <w:proofErr w:type="spellEnd"/>
-                            <w:r>
-                              <w:rPr>
-                                <w:rFonts w:ascii="Arial" w:hAnsi="Arial" w:cs="Arial"/>
-                                <w:b/>
-                                <w:bCs/>
-                                <w:color w:val="FFFFFF" w:themeColor="background1"/>
-                                <w:sz w:val="10"/>
-                                <w:szCs w:val="10"/>
-                              </w:rPr>
-                              <w:t xml:space="preserve"> </w:t>
-                            </w:r>
-                            <w:proofErr w:type="spellStart"/>
-                            <w:r>
-                              <w:rPr>
-                                <w:rFonts w:ascii="Arial" w:hAnsi="Arial" w:cs="Arial"/>
-                                <w:b/>
-                                <w:bCs/>
-                                <w:color w:val="FFFFFF" w:themeColor="background1"/>
-                                <w:sz w:val="10"/>
-                                <w:szCs w:val="10"/>
-                              </w:rPr>
-                              <w:t>methode</w:t>
-                            </w:r>
-                            <w:proofErr w:type="spellEnd"/>
                           </w:p>
                         </w:txbxContent>
                       </v:textbox>
@@ -4106,31 +3149,7 @@
                                       <w:szCs w:val="10"/>
                                     </w:rPr>
                                     <w:br/>
-                                    <w:t>{</w:t>
-                                  </w:r>
-                                  <w:proofErr w:type="spellStart"/>
-                                  <w:r>
-                                    <w:rPr>
-                                      <w:rFonts w:ascii="Arial" w:hAnsi="Arial" w:cs="Arial"/>
-                                      <w:b/>
-                                      <w:bCs/>
-                                      <w:color w:val="FFFFFF" w:themeColor="background1"/>
-                                      <w:sz w:val="10"/>
-                                      <w:szCs w:val="10"/>
-                                    </w:rPr>
-                                    <w:t>donut_chart_diverse_pct</w:t>
-                                  </w:r>
-                                  <w:proofErr w:type="spellEnd"/>
-                                  <w:r>
-                                    <w:rPr>
-                                      <w:rFonts w:ascii="Arial" w:hAnsi="Arial" w:cs="Arial"/>
-                                      <w:b/>
-                                      <w:bCs/>
-                                      <w:color w:val="FFFFFF" w:themeColor="background1"/>
-                                      <w:sz w:val="10"/>
-                                      <w:szCs w:val="10"/>
-                                    </w:rPr>
-                                    <w:t>}</w:t>
+                                    <w:t>{donut_chart_diverse_pct}</w:t>
                                   </w:r>
                                 </w:p>
                               </w:txbxContent>
@@ -4192,31 +3211,7 @@
                                 <w:szCs w:val="10"/>
                               </w:rPr>
                               <w:br/>
-                              <w:t>{</w:t>
-                            </w:r>
-                            <w:proofErr w:type="spellStart"/>
-                            <w:r>
-                              <w:rPr>
-                                <w:rFonts w:ascii="Arial" w:hAnsi="Arial" w:cs="Arial"/>
-                                <w:b/>
-                                <w:bCs/>
-                                <w:color w:val="FFFFFF" w:themeColor="background1"/>
-                                <w:sz w:val="10"/>
-                                <w:szCs w:val="10"/>
-                              </w:rPr>
-                              <w:t>donut_chart_diverse_pct</w:t>
-                            </w:r>
-                            <w:proofErr w:type="spellEnd"/>
-                            <w:r>
-                              <w:rPr>
-                                <w:rFonts w:ascii="Arial" w:hAnsi="Arial" w:cs="Arial"/>
-                                <w:b/>
-                                <w:bCs/>
-                                <w:color w:val="FFFFFF" w:themeColor="background1"/>
-                                <w:sz w:val="10"/>
-                                <w:szCs w:val="10"/>
-                              </w:rPr>
-                              <w:t>}</w:t>
+                              <w:t>{donut_chart_diverse_pct}</w:t>
                             </w:r>
                           </w:p>
                         </w:txbxContent>
@@ -4308,33 +3303,7 @@
                                       <w:lang w:val="nl-NL"/>
                                     </w:rPr>
                                     <w:br/>
-                                    <w:t>{</w:t>
-                                  </w:r>
-                                  <w:proofErr w:type="spellStart"/>
-                                  <w:r>
-                                    <w:rPr>
-                                      <w:rFonts w:ascii="Arial" w:hAnsi="Arial" w:cs="Arial"/>
-                                      <w:b/>
-                                      <w:bCs/>
-                                      <w:color w:val="FFFFFF" w:themeColor="background1"/>
-                                      <w:sz w:val="10"/>
-                                      <w:szCs w:val="10"/>
-                                      <w:lang w:val="nl-NL"/>
-                                    </w:rPr>
-                                    <w:t>donut_chart_dagelijkse_pct</w:t>
-                                  </w:r>
-                                  <w:proofErr w:type="spellEnd"/>
-                                  <w:r>
-                                    <w:rPr>
-                                      <w:rFonts w:ascii="Arial" w:hAnsi="Arial" w:cs="Arial"/>
-                                      <w:b/>
-                                      <w:bCs/>
-                                      <w:color w:val="FFFFFF" w:themeColor="background1"/>
-                                      <w:sz w:val="10"/>
-                                      <w:szCs w:val="10"/>
-                                      <w:lang w:val="nl-NL"/>
-                                    </w:rPr>
-                                    <w:t>}</w:t>
+                                    <w:t>{donut_chart_dagelijkse_pct}</w:t>
                                   </w:r>
                                 </w:p>
                               </w:txbxContent>
@@ -4399,33 +3368,7 @@
                                 <w:lang w:val="nl-NL"/>
                               </w:rPr>
                               <w:br/>
-                              <w:t>{</w:t>
-                            </w:r>
-                            <w:proofErr w:type="spellStart"/>
-                            <w:r>
-                              <w:rPr>
-                                <w:rFonts w:ascii="Arial" w:hAnsi="Arial" w:cs="Arial"/>
-                                <w:b/>
-                                <w:bCs/>
-                                <w:color w:val="FFFFFF" w:themeColor="background1"/>
-                                <w:sz w:val="10"/>
-                                <w:szCs w:val="10"/>
-                                <w:lang w:val="nl-NL"/>
-                              </w:rPr>
-                              <w:t>donut_chart_dagelijkse_pct</w:t>
-                            </w:r>
-                            <w:proofErr w:type="spellEnd"/>
-                            <w:r>
-                              <w:rPr>
-                                <w:rFonts w:ascii="Arial" w:hAnsi="Arial" w:cs="Arial"/>
-                                <w:b/>
-                                <w:bCs/>
-                                <w:color w:val="FFFFFF" w:themeColor="background1"/>
-                                <w:sz w:val="10"/>
-                                <w:szCs w:val="10"/>
-                                <w:lang w:val="nl-NL"/>
-                              </w:rPr>
-                              <w:t>}</w:t>
+                              <w:t>{donut_chart_dagelijkse_pct}</w:t>
                             </w:r>
                           </w:p>
                         </w:txbxContent>
@@ -4493,7 +3436,6 @@
                                       <w:szCs w:val="10"/>
                                     </w:rPr>
                                   </w:pPr>
-                                  <w:proofErr w:type="spellStart"/>
                                   <w:r>
                                     <w:rPr>
                                       <w:rFonts w:ascii="Arial" w:hAnsi="Arial" w:cs="Arial"/>
@@ -4505,7 +3447,6 @@
                                     </w:rPr>
                                     <w:t>Cumulatief</w:t>
                                   </w:r>
-                                  <w:proofErr w:type="spellEnd"/>
                                   <w:r>
                                     <w:rPr>
                                       <w:rFonts w:ascii="Arial" w:hAnsi="Arial" w:cs="Arial"/>
@@ -4516,31 +3457,7 @@
                                       <w:szCs w:val="10"/>
                                     </w:rPr>
                                     <w:br/>
-                                    <w:t>{</w:t>
-                                  </w:r>
-                                  <w:proofErr w:type="spellStart"/>
-                                  <w:r>
-                                    <w:rPr>
-                                      <w:rFonts w:ascii="Arial" w:hAnsi="Arial" w:cs="Arial"/>
-                                      <w:b/>
-                                      <w:bCs/>
-                                      <w:color w:val="FFFFFF" w:themeColor="background1"/>
-                                      <w:sz w:val="10"/>
-                                      <w:szCs w:val="10"/>
-                                    </w:rPr>
-                                    <w:t>donut_chart_cumulatief_pct</w:t>
-                                  </w:r>
-                                  <w:proofErr w:type="spellEnd"/>
-                                  <w:r>
-                                    <w:rPr>
-                                      <w:rFonts w:ascii="Arial" w:hAnsi="Arial" w:cs="Arial"/>
-                                      <w:b/>
-                                      <w:bCs/>
-                                      <w:color w:val="FFFFFF" w:themeColor="background1"/>
-                                      <w:sz w:val="10"/>
-                                      <w:szCs w:val="10"/>
-                                    </w:rPr>
-                                    <w:t>}</w:t>
+                                    <w:t>{donut_chart_cumulatief_pct}</w:t>
                                   </w:r>
                                 </w:p>
                               </w:txbxContent>
@@ -4581,7 +3498,6 @@
                                 <w:szCs w:val="10"/>
                               </w:rPr>
                             </w:pPr>
-                            <w:proofErr w:type="spellStart"/>
                             <w:r>
                               <w:rPr>
                                 <w:rFonts w:ascii="Arial" w:hAnsi="Arial" w:cs="Arial"/>
@@ -4593,7 +3509,6 @@
                               </w:rPr>
                               <w:t>Cumulatief</w:t>
                             </w:r>
-                            <w:proofErr w:type="spellEnd"/>
                             <w:r>
                               <w:rPr>
                                 <w:rFonts w:ascii="Arial" w:hAnsi="Arial" w:cs="Arial"/>
@@ -4604,31 +3519,7 @@
                                 <w:szCs w:val="10"/>
                               </w:rPr>
                               <w:br/>
-                              <w:t>{</w:t>
-                            </w:r>
-                            <w:proofErr w:type="spellStart"/>
-                            <w:r>
-                              <w:rPr>
-                                <w:rFonts w:ascii="Arial" w:hAnsi="Arial" w:cs="Arial"/>
-                                <w:b/>
-                                <w:bCs/>
-                                <w:color w:val="FFFFFF" w:themeColor="background1"/>
-                                <w:sz w:val="10"/>
-                                <w:szCs w:val="10"/>
-                              </w:rPr>
-                              <w:t>donut_chart_cumulatief_pct</w:t>
-                            </w:r>
-                            <w:proofErr w:type="spellEnd"/>
-                            <w:r>
-                              <w:rPr>
-                                <w:rFonts w:ascii="Arial" w:hAnsi="Arial" w:cs="Arial"/>
-                                <w:b/>
-                                <w:bCs/>
-                                <w:color w:val="FFFFFF" w:themeColor="background1"/>
-                                <w:sz w:val="10"/>
-                                <w:szCs w:val="10"/>
-                              </w:rPr>
-                              <w:t>}</w:t>
+                              <w:t>{donut_chart_cumulatief_pct}</w:t>
                             </w:r>
                           </w:p>
                         </w:txbxContent>
@@ -4644,36 +3535,16 @@
                 <w:szCs w:val="16"/>
                 <w:lang w:val="nl-NL"/>
               </w:rPr>
-              <w:t>{</w:t>
+              <w:t xml:space="preserve">{aopchart </w:t>
             </w:r>
-            <w:proofErr w:type="spellStart"/>
             <w:r>
               <w:rPr>
                 <w:sz w:val="16"/>
                 <w:szCs w:val="16"/>
                 <w:lang w:val="nl-NL"/>
               </w:rPr>
-              <w:t>aopchart</w:t>
-            </w:r>
-            <w:proofErr w:type="spellEnd"/>
-            <w:r>
-              <w:rPr>
-                <w:sz w:val="16"/>
-                <w:szCs w:val="16"/>
-                <w:lang w:val="nl-NL"/>
-              </w:rPr>
-              <w:t xml:space="preserve"> </w:t>
-            </w:r>
-            <w:proofErr w:type="spellStart"/>
-            <w:r>
-              <w:rPr>
-                <w:sz w:val="16"/>
-                <w:szCs w:val="16"/>
-                <w:lang w:val="nl-NL"/>
-              </w:rPr>
               <w:t>donutChart</w:t>
             </w:r>
-            <w:proofErr w:type="spellEnd"/>
             <w:r>
               <w:rPr>
                 <w:sz w:val="16"/>
@@ -4809,7 +3680,6 @@
                 <w:szCs w:val="18"/>
               </w:rPr>
             </w:pPr>
-            <w:proofErr w:type="spellStart"/>
             <w:r>
               <w:rPr>
                 <w:rFonts w:ascii="Arial" w:hAnsi="Arial" w:cs="Arial"/>
@@ -4821,7 +3691,6 @@
               <w:lastRenderedPageBreak/>
               <w:t>Categorie</w:t>
             </w:r>
-            <w:proofErr w:type="spellEnd"/>
           </w:p>
         </w:tc>
         <w:tc>
@@ -4882,7 +3751,6 @@
                 <w:szCs w:val="18"/>
               </w:rPr>
             </w:pPr>
-            <w:proofErr w:type="spellStart"/>
             <w:r>
               <w:rPr>
                 <w:rFonts w:ascii="Arial" w:hAnsi="Arial" w:cs="Arial"/>
@@ -4893,7 +3761,6 @@
               </w:rPr>
               <w:t>Goedkeurgrens</w:t>
             </w:r>
-            <w:proofErr w:type="spellEnd"/>
           </w:p>
         </w:tc>
         <w:tc>
@@ -4919,7 +3786,6 @@
                 <w:szCs w:val="18"/>
               </w:rPr>
             </w:pPr>
-            <w:proofErr w:type="spellStart"/>
             <w:r>
               <w:rPr>
                 <w:rFonts w:ascii="Arial" w:hAnsi="Arial" w:cs="Arial"/>
@@ -4928,53 +3794,8 @@
                 <w:sz w:val="18"/>
                 <w:szCs w:val="18"/>
               </w:rPr>
-              <w:t>Aantal</w:t>
+              <w:t>Aantal behaalde fouten</w:t>
             </w:r>
-            <w:proofErr w:type="spellEnd"/>
-            <w:r>
-              <w:rPr>
-                <w:rFonts w:ascii="Arial" w:hAnsi="Arial" w:cs="Arial"/>
-                <w:b/>
-                <w:bCs/>
-                <w:sz w:val="18"/>
-                <w:szCs w:val="18"/>
-              </w:rPr>
-              <w:t xml:space="preserve"> </w:t>
-            </w:r>
-            <w:proofErr w:type="spellStart"/>
-            <w:r>
-              <w:rPr>
-                <w:rFonts w:ascii="Arial" w:hAnsi="Arial" w:cs="Arial"/>
-                <w:b/>
-                <w:bCs/>
-                <w:sz w:val="18"/>
-                <w:szCs w:val="18"/>
-              </w:rPr>
-              <w:t>behaalde</w:t>
-            </w:r>
-            <w:proofErr w:type="spellEnd"/>
-            <w:r>
-              <w:rPr>
-                <w:rFonts w:ascii="Arial" w:hAnsi="Arial" w:cs="Arial"/>
-                <w:b/>
-                <w:bCs/>
-                <w:sz w:val="18"/>
-                <w:szCs w:val="18"/>
-              </w:rPr>
-              <w:t xml:space="preserve"> </w:t>
-            </w:r>
-            <w:proofErr w:type="spellStart"/>
-            <w:r>
-              <w:rPr>
-                <w:rFonts w:ascii="Arial" w:hAnsi="Arial" w:cs="Arial"/>
-                <w:b/>
-                <w:bCs/>
-                <w:sz w:val="18"/>
-                <w:szCs w:val="18"/>
-              </w:rPr>
-              <w:t>fouten</w:t>
-            </w:r>
-            <w:proofErr w:type="spellEnd"/>
           </w:p>
         </w:tc>
         <w:tc>
@@ -5000,7 +3821,6 @@
                 <w:szCs w:val="18"/>
               </w:rPr>
             </w:pPr>
-            <w:proofErr w:type="spellStart"/>
             <w:r>
               <w:rPr>
                 <w:rFonts w:ascii="Arial" w:hAnsi="Arial" w:cs="Arial"/>
@@ -5011,7 +3831,6 @@
               </w:rPr>
               <w:t>Beoordeling</w:t>
             </w:r>
-            <w:proofErr w:type="spellEnd"/>
           </w:p>
         </w:tc>
       </w:tr>
@@ -5075,25 +3894,7 @@
                 <w:sz w:val="18"/>
                 <w:szCs w:val="18"/>
               </w:rPr>
-              <w:t>{</w:t>
-            </w:r>
-            <w:proofErr w:type="spellStart"/>
-            <w:r>
-              <w:rPr>
-                <w:rFonts w:ascii="Arial" w:hAnsi="Arial" w:cs="Arial"/>
-                <w:sz w:val="18"/>
-                <w:szCs w:val="18"/>
-              </w:rPr>
-              <w:t>tel_elementen</w:t>
-            </w:r>
-            <w:proofErr w:type="spellEnd"/>
-            <w:r>
-              <w:rPr>
-                <w:rFonts w:ascii="Arial" w:hAnsi="Arial" w:cs="Arial"/>
-                <w:sz w:val="18"/>
-                <w:szCs w:val="18"/>
-              </w:rPr>
-              <w:t>}</w:t>
+              <w:t>{tel_elementen}</w:t>
             </w:r>
           </w:p>
         </w:tc>
@@ -5123,25 +3924,7 @@
                 <w:sz w:val="18"/>
                 <w:szCs w:val="18"/>
               </w:rPr>
-              <w:t>{</w:t>
-            </w:r>
-            <w:proofErr w:type="spellStart"/>
-            <w:r>
-              <w:rPr>
-                <w:rFonts w:ascii="Arial" w:hAnsi="Arial" w:cs="Arial"/>
-                <w:sz w:val="18"/>
-                <w:szCs w:val="18"/>
-              </w:rPr>
-              <w:t>goedkeurgrens</w:t>
-            </w:r>
-            <w:proofErr w:type="spellEnd"/>
-            <w:r>
-              <w:rPr>
-                <w:rFonts w:ascii="Arial" w:hAnsi="Arial" w:cs="Arial"/>
-                <w:sz w:val="18"/>
-                <w:szCs w:val="18"/>
-              </w:rPr>
-              <w:t>}</w:t>
+              <w:t>{goedkeurgrens}</w:t>
             </w:r>
           </w:p>
         </w:tc>
@@ -5172,25 +3955,7 @@
                 <w:sz w:val="18"/>
                 <w:szCs w:val="18"/>
               </w:rPr>
-              <w:t>{</w:t>
-            </w:r>
-            <w:proofErr w:type="spellStart"/>
-            <w:r>
-              <w:rPr>
-                <w:rFonts w:ascii="Arial" w:hAnsi="Arial" w:cs="Arial"/>
-                <w:sz w:val="18"/>
-                <w:szCs w:val="18"/>
-              </w:rPr>
-              <w:t>aantal_fouten</w:t>
-            </w:r>
-            <w:proofErr w:type="spellEnd"/>
-            <w:r>
-              <w:rPr>
-                <w:rFonts w:ascii="Arial" w:hAnsi="Arial" w:cs="Arial"/>
-                <w:sz w:val="18"/>
-                <w:szCs w:val="18"/>
-              </w:rPr>
-              <w:t>}</w:t>
+              <w:t>{aantal_fouten}</w:t>
             </w:r>
           </w:p>
         </w:tc>
@@ -5429,7 +4194,6 @@
                 <w:lang w:val="nl-NL"/>
               </w:rPr>
             </w:pPr>
-            <w:proofErr w:type="spellStart"/>
             <w:r>
               <w:rPr>
                 <w:rFonts w:ascii="Arial" w:hAnsi="Arial" w:cs="Arial"/>
@@ -5440,7 +4204,6 @@
               </w:rPr>
               <w:t>Categorie</w:t>
             </w:r>
-            <w:proofErr w:type="spellEnd"/>
           </w:p>
         </w:tc>
         <w:tc>
@@ -5507,7 +4270,6 @@
                 <w:lang w:val="nl-NL"/>
               </w:rPr>
             </w:pPr>
-            <w:proofErr w:type="spellStart"/>
             <w:r>
               <w:rPr>
                 <w:rFonts w:ascii="Arial" w:hAnsi="Arial" w:cs="Arial"/>
@@ -5518,7 +4280,6 @@
               </w:rPr>
               <w:t>Vuilsoort</w:t>
             </w:r>
-            <w:proofErr w:type="spellEnd"/>
           </w:p>
         </w:tc>
         <w:tc>
@@ -5547,7 +4308,6 @@
                 <w:lang w:val="nl-NL"/>
               </w:rPr>
             </w:pPr>
-            <w:proofErr w:type="spellStart"/>
             <w:r>
               <w:rPr>
                 <w:rFonts w:ascii="Arial" w:hAnsi="Arial" w:cs="Arial"/>
@@ -5558,7 +4318,6 @@
               </w:rPr>
               <w:t>Opmerking</w:t>
             </w:r>
-            <w:proofErr w:type="spellEnd"/>
           </w:p>
         </w:tc>
         <w:tc>
@@ -5580,7 +4339,6 @@
                 <w:szCs w:val="24"/>
               </w:rPr>
             </w:pPr>
-            <w:proofErr w:type="spellStart"/>
             <w:r>
               <w:rPr>
                 <w:rFonts w:ascii="Arial" w:hAnsi="Arial" w:cs="Arial"/>
@@ -5589,62 +4347,7 @@
                 <w:sz w:val="24"/>
                 <w:szCs w:val="24"/>
               </w:rPr>
-              <w:t>Aantal</w:t>
-            </w:r>
-            <w:proofErr w:type="spellEnd"/>
-            <w:r>
-              <w:rPr>
-                <w:rFonts w:ascii="Arial" w:hAnsi="Arial" w:cs="Arial"/>
-                <w:b/>
-                <w:bCs/>
-                <w:sz w:val="24"/>
-                <w:szCs w:val="24"/>
-              </w:rPr>
-              <w:t xml:space="preserve"> </w:t>
-            </w:r>
-            <w:proofErr w:type="spellStart"/>
-            <w:r>
-              <w:rPr>
-                <w:rFonts w:ascii="Arial" w:hAnsi="Arial" w:cs="Arial"/>
-                <w:b/>
-                <w:bCs/>
-                <w:sz w:val="24"/>
-                <w:szCs w:val="24"/>
-              </w:rPr>
-              <w:t>fout</w:t>
-            </w:r>
-            <w:proofErr w:type="spellEnd"/>
-            <w:r>
-              <w:rPr>
-                <w:rFonts w:ascii="Arial" w:hAnsi="Arial" w:cs="Arial"/>
-                <w:b/>
-                <w:bCs/>
-                <w:sz w:val="24"/>
-                <w:szCs w:val="24"/>
-              </w:rPr>
-              <w:t>(</w:t>
-            </w:r>
-            <w:proofErr w:type="spellStart"/>
-            <w:r>
-              <w:rPr>
-                <w:rFonts w:ascii="Arial" w:hAnsi="Arial" w:cs="Arial"/>
-                <w:b/>
-                <w:bCs/>
-                <w:sz w:val="24"/>
-                <w:szCs w:val="24"/>
-              </w:rPr>
-              <w:t>en</w:t>
-            </w:r>
-            <w:proofErr w:type="spellEnd"/>
-            <w:r>
-              <w:rPr>
-                <w:rFonts w:ascii="Arial" w:hAnsi="Arial" w:cs="Arial"/>
-                <w:b/>
-                <w:bCs/>
-                <w:sz w:val="24"/>
-                <w:szCs w:val="24"/>
-              </w:rPr>
-              <w:t>)</w:t>
+              <w:t>Aantal fout(en)</w:t>
             </w:r>
           </w:p>
         </w:tc>
@@ -5674,7 +4377,6 @@
                 <w:lang w:val="nl-NL"/>
               </w:rPr>
             </w:pPr>
-            <w:proofErr w:type="spellStart"/>
             <w:r>
               <w:rPr>
                 <w:rFonts w:ascii="Arial" w:hAnsi="Arial" w:cs="Arial"/>
@@ -5683,18 +4385,7 @@
                 <w:sz w:val="24"/>
                 <w:szCs w:val="24"/>
               </w:rPr>
-              <w:t>Foto</w:t>
-            </w:r>
-            <w:proofErr w:type="spellEnd"/>
-            <w:r>
-              <w:rPr>
-                <w:rFonts w:ascii="Arial" w:hAnsi="Arial" w:cs="Arial"/>
-                <w:b/>
-                <w:bCs/>
-                <w:sz w:val="24"/>
-                <w:szCs w:val="24"/>
-              </w:rPr>
-              <w:t xml:space="preserve"> nr.</w:t>
+              <w:t>Foto nr.</w:t>
             </w:r>
           </w:p>
         </w:tc>
@@ -5763,25 +4454,7 @@
                 <w:sz w:val="18"/>
                 <w:szCs w:val="18"/>
               </w:rPr>
-              <w:t>{</w:t>
-            </w:r>
-            <w:proofErr w:type="spellStart"/>
-            <w:r>
-              <w:rPr>
-                <w:rFonts w:ascii="Arial" w:hAnsi="Arial" w:cs="Arial"/>
-                <w:sz w:val="18"/>
-                <w:szCs w:val="18"/>
-              </w:rPr>
-              <w:t>categorie</w:t>
-            </w:r>
-            <w:proofErr w:type="spellEnd"/>
-            <w:r>
-              <w:rPr>
-                <w:rFonts w:ascii="Arial" w:hAnsi="Arial" w:cs="Arial"/>
-                <w:sz w:val="18"/>
-                <w:szCs w:val="18"/>
-              </w:rPr>
-              <w:t>}</w:t>
+              <w:t>{categorie}</w:t>
             </w:r>
           </w:p>
         </w:tc>
@@ -5843,25 +4516,7 @@
                 <w:sz w:val="18"/>
                 <w:szCs w:val="18"/>
               </w:rPr>
-              <w:t>{</w:t>
-            </w:r>
-            <w:proofErr w:type="spellStart"/>
-            <w:r>
-              <w:rPr>
-                <w:rFonts w:ascii="Arial" w:hAnsi="Arial" w:cs="Arial"/>
-                <w:sz w:val="18"/>
-                <w:szCs w:val="18"/>
-              </w:rPr>
-              <w:t>vuilsoort</w:t>
-            </w:r>
-            <w:proofErr w:type="spellEnd"/>
-            <w:r>
-              <w:rPr>
-                <w:rFonts w:ascii="Arial" w:hAnsi="Arial" w:cs="Arial"/>
-                <w:sz w:val="18"/>
-                <w:szCs w:val="18"/>
-              </w:rPr>
-              <w:t>}</w:t>
+              <w:t>{vuilsoort}</w:t>
             </w:r>
           </w:p>
         </w:tc>
@@ -5892,25 +4547,7 @@
                 <w:sz w:val="18"/>
                 <w:szCs w:val="18"/>
               </w:rPr>
-              <w:t>{</w:t>
-            </w:r>
-            <w:proofErr w:type="spellStart"/>
-            <w:r>
-              <w:rPr>
-                <w:rFonts w:ascii="Arial" w:hAnsi="Arial" w:cs="Arial"/>
-                <w:sz w:val="18"/>
-                <w:szCs w:val="18"/>
-              </w:rPr>
-              <w:t>opmerking</w:t>
-            </w:r>
-            <w:proofErr w:type="spellEnd"/>
-            <w:r>
-              <w:rPr>
-                <w:rFonts w:ascii="Arial" w:hAnsi="Arial" w:cs="Arial"/>
-                <w:sz w:val="18"/>
-                <w:szCs w:val="18"/>
-              </w:rPr>
-              <w:t>}</w:t>
+              <w:t>{opmerking}</w:t>
             </w:r>
           </w:p>
         </w:tc>
@@ -5938,7 +4575,6 @@
               </w:rPr>
               <w:t>{</w:t>
             </w:r>
-            <w:proofErr w:type="spellStart"/>
             <w:r>
               <w:rPr>
                 <w:rFonts w:ascii="Arial" w:hAnsi="Arial" w:cs="Arial"/>
@@ -5947,7 +4583,6 @@
               </w:rPr>
               <w:t>aantal_fouten</w:t>
             </w:r>
-            <w:proofErr w:type="spellEnd"/>
             <w:r>
               <w:rPr>
                 <w:rFonts w:ascii="Arial" w:hAnsi="Arial" w:cs="Arial"/>
@@ -5987,36 +4622,17 @@
                 <w:sz w:val="18"/>
                 <w:szCs w:val="18"/>
               </w:rPr>
-              <w:t>{</w:t>
+              <w:t>{foto_nr}</w:t>
             </w:r>
-            <w:proofErr w:type="spellStart"/>
             <w:r>
               <w:rPr>
                 <w:rFonts w:ascii="Arial" w:hAnsi="Arial" w:cs="Arial"/>
                 <w:sz w:val="18"/>
                 <w:szCs w:val="18"/>
               </w:rPr>
-              <w:t>foto_nr</w:t>
-            </w:r>
-            <w:proofErr w:type="spellEnd"/>
-            <w:r>
-              <w:rPr>
-                <w:rFonts w:ascii="Arial" w:hAnsi="Arial" w:cs="Arial"/>
-                <w:sz w:val="18"/>
-                <w:szCs w:val="18"/>
-              </w:rPr>
-              <w:t>}</w:t>
-            </w:r>
-            <w:r>
-              <w:rPr>
-                <w:rFonts w:ascii="Arial" w:hAnsi="Arial" w:cs="Arial"/>
-                <w:sz w:val="18"/>
-                <w:szCs w:val="18"/>
-              </w:rPr>
               <w:br/>
               <w:t>{/</w:t>
             </w:r>
-            <w:proofErr w:type="spellStart"/>
             <w:r>
               <w:rPr>
                 <w:rFonts w:ascii="Arial" w:hAnsi="Arial" w:cs="Arial"/>
@@ -6024,17 +4640,7 @@
                 <w:szCs w:val="18"/>
                 <w:lang w:val="nl-NL"/>
               </w:rPr>
-              <w:t>ruimteniveau_opmerkingen</w:t>
-            </w:r>
-            <w:proofErr w:type="spellEnd"/>
-            <w:r>
-              <w:rPr>
-                <w:rFonts w:ascii="Arial" w:hAnsi="Arial" w:cs="Arial"/>
-                <w:sz w:val="18"/>
-                <w:szCs w:val="18"/>
-                <w:lang w:val="nl-NL"/>
-              </w:rPr>
-              <w:t>}</w:t>
+              <w:t>ruimteniveau_opmerkingen}</w:t>
             </w:r>
           </w:p>
         </w:tc>
@@ -6084,60 +4690,7 @@
           <w:lang w:val="nl-NL"/>
         </w:rPr>
         <w:lastRenderedPageBreak/>
-        <w:t>{#htmlContent.length &gt; 1}</w:t>
-      </w:r>
-      <w:r>
-        <w:rPr>
-          <w:rFonts w:ascii="Arial" w:hAnsi="Arial" w:cs="Arial"/>
-          <w:b/>
-          <w:bCs/>
-          <w:sz w:val="28"/>
-          <w:szCs w:val="28"/>
-          <w:lang w:val="nl-NL"/>
-        </w:rPr>
-        <w:t>Opmerking Element:</w:t>
-      </w:r>
-      <w:r>
-        <w:rPr>
-          <w:lang w:val="nl-NL"/>
-        </w:rPr>
-        <w:t xml:space="preserve"> </w:t>
-      </w:r>
-      <w:r>
-        <w:rPr>
-          <w:sz w:val="16"/>
-          <w:szCs w:val="16"/>
-          <w:lang w:val="nl-NL"/>
-        </w:rPr>
-        <w:t>{_</w:t>
-      </w:r>
-      <w:proofErr w:type="spellStart"/>
-      <w:r>
-        <w:rPr>
-          <w:sz w:val="16"/>
-          <w:szCs w:val="16"/>
-          <w:lang w:val="nl-NL"/>
-        </w:rPr>
-        <w:t>htmlContent</w:t>
-      </w:r>
-      <w:proofErr w:type="spellEnd"/>
-      <w:r>
-        <w:rPr>
-          <w:sz w:val="16"/>
-          <w:szCs w:val="16"/>
-          <w:lang w:val="nl-NL"/>
-        </w:rPr>
-        <w:t>}</w:t>
-      </w:r>
-      <w:r>
-        <w:rPr>
-          <w:rFonts w:ascii="Cascadia Code PL" w:eastAsia="Times New Roman" w:hAnsi="Cascadia Code PL" w:cs="Cascadia Code PL"/>
-          <w:color w:val="6A9955"/>
-          <w:sz w:val="21"/>
-          <w:szCs w:val="21"/>
-          <w:lang w:val="nl-NL" w:bidi="ar-SA"/>
-        </w:rPr>
-        <w:t xml:space="preserve"> </w:t>
+        <w:t>{#htmlContent.length &gt; 1</w:t>
       </w:r>
       <w:r>
         <w:rPr>
@@ -6148,9 +4701,8 @@
           <w:szCs w:val="16"/>
           <w:lang w:val="nl-NL"/>
         </w:rPr>
-        <w:t>{/</w:t>
-      </w:r>
-      <w:proofErr w:type="spellStart"/>
+        <w:t>}</w:t>
+      </w:r>
       <w:r>
         <w:rPr>
           <w:rFonts w:ascii="Arial" w:hAnsi="Arial" w:cs="Arial"/>
@@ -6160,9 +4712,32 @@
           <w:szCs w:val="16"/>
           <w:lang w:val="nl-NL"/>
         </w:rPr>
-        <w:t>htmlContent.length</w:t>
-      </w:r>
-      <w:proofErr w:type="spellEnd"/>
+        <w:t xml:space="preserve"> </w:t>
+      </w:r>
+      <w:r>
+        <w:rPr>
+          <w:sz w:val="16"/>
+          <w:szCs w:val="16"/>
+          <w:lang w:val="nl-NL"/>
+        </w:rPr>
+        <w:t>{_htmlContent</w:t>
+      </w:r>
+      <w:r>
+        <w:rPr>
+          <w:sz w:val="16"/>
+          <w:szCs w:val="16"/>
+          <w:lang w:val="nl-NL"/>
+        </w:rPr>
+        <w:t>}</w:t>
+      </w:r>
+      <w:r>
+        <w:rPr>
+          <w:sz w:val="16"/>
+          <w:szCs w:val="16"/>
+          <w:lang w:val="nl-NL"/>
+        </w:rPr>
+        <w:t xml:space="preserve"> </w:t>
+      </w:r>
       <w:r>
         <w:rPr>
           <w:rFonts w:ascii="Arial" w:hAnsi="Arial" w:cs="Arial"/>
@@ -6172,7 +4747,7 @@
           <w:szCs w:val="16"/>
           <w:lang w:val="nl-NL"/>
         </w:rPr>
-        <w:t xml:space="preserve"> &gt; 1}</w:t>
+        <w:t>{/htmlContent.length &gt; 1}</w:t>
       </w:r>
       <w:r>
         <w:rPr>
@@ -6273,7 +4848,6 @@
                 <w:lang w:val="nl-NL"/>
               </w:rPr>
             </w:pPr>
-            <w:proofErr w:type="spellStart"/>
             <w:r>
               <w:rPr>
                 <w:rFonts w:ascii="Arial" w:hAnsi="Arial" w:cs="Arial"/>
@@ -6284,7 +4858,6 @@
               </w:rPr>
               <w:t>Opmerkingen</w:t>
             </w:r>
-            <w:proofErr w:type="spellEnd"/>
             <w:r>
               <w:rPr>
                 <w:rFonts w:ascii="Arial" w:hAnsi="Arial" w:cs="Arial"/>
@@ -6362,27 +4935,8 @@
                 <w:sz w:val="18"/>
                 <w:szCs w:val="18"/>
               </w:rPr>
-              <w:t>{</w:t>
+              <w:t>{opmerking}{/</w:t>
             </w:r>
-            <w:proofErr w:type="spellStart"/>
-            <w:r>
-              <w:rPr>
-                <w:rFonts w:ascii="Arial" w:hAnsi="Arial" w:cs="Arial"/>
-                <w:sz w:val="18"/>
-                <w:szCs w:val="18"/>
-              </w:rPr>
-              <w:t>opmerking</w:t>
-            </w:r>
-            <w:proofErr w:type="spellEnd"/>
-            <w:r>
-              <w:rPr>
-                <w:rFonts w:ascii="Arial" w:hAnsi="Arial" w:cs="Arial"/>
-                <w:sz w:val="18"/>
-                <w:szCs w:val="18"/>
-              </w:rPr>
-              <w:t>}{/</w:t>
-            </w:r>
-            <w:proofErr w:type="spellStart"/>
             <w:r>
               <w:rPr>
                 <w:rFonts w:ascii="Arial" w:hAnsi="Arial" w:cs="Arial"/>
@@ -6390,17 +4944,7 @@
                 <w:szCs w:val="18"/>
                 <w:lang w:val="nl-NL"/>
               </w:rPr>
-              <w:t>algemene_opmerkingen</w:t>
-            </w:r>
-            <w:proofErr w:type="spellEnd"/>
-            <w:r>
-              <w:rPr>
-                <w:rFonts w:ascii="Arial" w:hAnsi="Arial" w:cs="Arial"/>
-                <w:sz w:val="18"/>
-                <w:szCs w:val="18"/>
-                <w:lang w:val="nl-NL"/>
-              </w:rPr>
-              <w:t>}</w:t>
+              <w:t>algemene_opmerkingen}</w:t>
             </w:r>
           </w:p>
         </w:tc>
@@ -6417,7 +4961,6 @@
       <w:pPr>
         <w:spacing w:after="0" w:line="240" w:lineRule="auto"/>
       </w:pPr>
-      <w:proofErr w:type="spellStart"/>
       <w:r>
         <w:rPr>
           <w:rFonts w:ascii="Arial" w:eastAsia="Arial" w:hAnsi="Arial"/>
@@ -6425,69 +4968,8 @@
           <w:color w:val="000000"/>
           <w:sz w:val="18"/>
         </w:rPr>
-        <w:t>Overige</w:t>
-      </w:r>
-      <w:proofErr w:type="spellEnd"/>
-      <w:r>
-        <w:rPr>
-          <w:rFonts w:ascii="Arial" w:eastAsia="Arial" w:hAnsi="Arial"/>
-          <w:b/>
-          <w:color w:val="000000"/>
-          <w:sz w:val="18"/>
-        </w:rPr>
-        <w:t xml:space="preserve">- </w:t>
-      </w:r>
-      <w:proofErr w:type="spellStart"/>
-      <w:r>
-        <w:rPr>
-          <w:rFonts w:ascii="Arial" w:eastAsia="Arial" w:hAnsi="Arial"/>
-          <w:b/>
-          <w:color w:val="000000"/>
-          <w:sz w:val="18"/>
-        </w:rPr>
-        <w:t>en</w:t>
-      </w:r>
-      <w:proofErr w:type="spellEnd"/>
-      <w:r>
-        <w:rPr>
-          <w:rFonts w:ascii="Arial" w:eastAsia="Arial" w:hAnsi="Arial"/>
-          <w:b/>
-          <w:color w:val="000000"/>
-          <w:sz w:val="18"/>
-        </w:rPr>
-        <w:t xml:space="preserve"> </w:t>
-      </w:r>
-      <w:proofErr w:type="spellStart"/>
-      <w:r>
-        <w:rPr>
-          <w:rFonts w:ascii="Arial" w:eastAsia="Arial" w:hAnsi="Arial"/>
-          <w:b/>
-          <w:color w:val="000000"/>
-          <w:sz w:val="18"/>
-        </w:rPr>
-        <w:t>hygiëne</w:t>
-      </w:r>
-      <w:proofErr w:type="spellEnd"/>
-      <w:r>
-        <w:rPr>
-          <w:rFonts w:ascii="Arial" w:eastAsia="Arial" w:hAnsi="Arial"/>
-          <w:b/>
-          <w:color w:val="000000"/>
-          <w:sz w:val="18"/>
-        </w:rPr>
-        <w:t xml:space="preserve"> </w:t>
-      </w:r>
-      <w:proofErr w:type="spellStart"/>
-      <w:r>
-        <w:rPr>
-          <w:rFonts w:ascii="Arial" w:eastAsia="Arial" w:hAnsi="Arial"/>
-          <w:b/>
-          <w:color w:val="000000"/>
-          <w:sz w:val="18"/>
-        </w:rPr>
-        <w:t>aspecten</w:t>
-      </w:r>
-      <w:proofErr w:type="spellEnd"/>
+        <w:t>Overige- en hygiëne aspecten</w:t>
+      </w:r>
     </w:p>
     <w:p>
       <w:pPr>
@@ -6619,7 +5101,6 @@
                 <w:szCs w:val="24"/>
               </w:rPr>
             </w:pPr>
-            <w:proofErr w:type="spellStart"/>
             <w:r>
               <w:rPr>
                 <w:rFonts w:ascii="Arial" w:hAnsi="Arial" w:cs="Arial"/>
@@ -6630,7 +5111,6 @@
               </w:rPr>
               <w:t>Opmerkingen</w:t>
             </w:r>
-            <w:proofErr w:type="spellEnd"/>
           </w:p>
         </w:tc>
       </w:tr>
@@ -6773,32 +5253,22 @@
                 <w:sz w:val="18"/>
                 <w:szCs w:val="18"/>
               </w:rPr>
-              <w:t>{</w:t>
+              <w:t>{opmerking</w:t>
             </w:r>
-            <w:proofErr w:type="spellStart"/>
             <w:r>
               <w:rPr>
                 <w:rFonts w:ascii="Arial" w:hAnsi="Arial" w:cs="Arial"/>
                 <w:sz w:val="18"/>
                 <w:szCs w:val="18"/>
               </w:rPr>
-              <w:t>opmerking</w:t>
+              <w:t>}</w:t>
             </w:r>
-            <w:proofErr w:type="spellEnd"/>
             <w:r>
               <w:rPr>
                 <w:rFonts w:ascii="Arial" w:hAnsi="Arial" w:cs="Arial"/>
                 <w:sz w:val="18"/>
                 <w:szCs w:val="18"/>
               </w:rPr>
-              <w:t>}</w:t>
-            </w:r>
-            <w:r>
-              <w:rPr>
-                <w:rFonts w:ascii="Arial" w:hAnsi="Arial" w:cs="Arial"/>
-                <w:sz w:val="18"/>
-                <w:szCs w:val="18"/>
-              </w:rPr>
               <w:t xml:space="preserve"> </w:t>
             </w:r>
             <w:r>
@@ -6809,7 +5279,6 @@
               </w:rPr>
               <w:t>{/</w:t>
             </w:r>
-            <w:proofErr w:type="spellStart"/>
             <w:r>
               <w:rPr>
                 <w:rFonts w:ascii="Arial" w:hAnsi="Arial" w:cs="Arial"/>
@@ -6817,23 +5286,19 @@
                 <w:szCs w:val="10"/>
                 <w:lang w:val="nl-NL"/>
               </w:rPr>
-              <w:t>overige_hygienische_aspecten</w:t>
-            </w:r>
-            <w:proofErr w:type="spellEnd"/>
-            <w:r>
-              <w:rPr>
-                <w:rFonts w:ascii="Arial" w:hAnsi="Arial" w:cs="Arial"/>
-                <w:sz w:val="10"/>
-                <w:szCs w:val="10"/>
-                <w:lang w:val="nl-NL"/>
-              </w:rPr>
-              <w:t>}</w:t>
+              <w:t>overige_hygienische_aspecten}</w:t>
             </w:r>
           </w:p>
         </w:tc>
       </w:tr>
     </w:tbl>
-    <w:p/>
+    <w:p>
+      <w:pPr>
+        <w:tabs>
+          <w:tab w:val="left" w:pos="1296"/>
+        </w:tabs>
+      </w:pPr>
+    </w:p>
     <w:sectPr>
       <w:pgSz w:w="12240" w:h="15840" w:code="1"/>
       <w:pgMar w:top="720" w:right="720" w:bottom="720" w:left="720" w:header="720" w:footer="720" w:gutter="0"/>
@@ -6993,7 +5458,6 @@
                             </w:rPr>
                             <w:t>{</w:t>
                           </w:r>
-                          <w:proofErr w:type="spellStart"/>
                           <w:r>
                             <w:rPr>
                               <w:rFonts w:ascii="Arial" w:eastAsia="Arial" w:hAnsi="Arial" w:cs="Arial"/>
@@ -7038,7 +5502,6 @@
                             </w:rPr>
                             <w:t>_volledig</w:t>
                           </w:r>
-                          <w:proofErr w:type="spellEnd"/>
                           <w:r>
                             <w:rPr>
                               <w:rFonts w:ascii="Arial" w:hAnsi="Arial" w:cs="Arial"/>
@@ -7362,7 +5825,6 @@
                       </w:rPr>
                       <w:t>{</w:t>
                     </w:r>
-                    <w:proofErr w:type="spellStart"/>
                     <w:r>
                       <w:rPr>
                         <w:rFonts w:ascii="Arial" w:eastAsia="Arial" w:hAnsi="Arial" w:cs="Arial"/>
@@ -7407,7 +5869,6 @@
                       </w:rPr>
                       <w:t>_volledig</w:t>
                     </w:r>
-                    <w:proofErr w:type="spellEnd"/>
                     <w:r>
                       <w:rPr>
                         <w:rFonts w:ascii="Arial" w:hAnsi="Arial" w:cs="Arial"/>
@@ -7910,33 +6371,7 @@
                                     <w:szCs w:val="20"/>
                                     <w:lang w:val="nl-NL"/>
                                   </w:rPr>
-                                  <w:t>{</w:t>
-                                </w:r>
-                                <w:proofErr w:type="spellStart"/>
-                                <w:r>
-                                  <w:rPr>
-                                    <w:rFonts w:ascii="Arial" w:eastAsia="Arial" w:hAnsi="Arial"/>
-                                    <w:i/>
-                                    <w:iCs/>
-                                    <w:color w:val="FFFFFF" w:themeColor="background1"/>
-                                    <w:sz w:val="20"/>
-                                    <w:szCs w:val="20"/>
-                                    <w:lang w:val="nl-NL"/>
-                                  </w:rPr>
-                                  <w:t>rapport_nummer</w:t>
-                                </w:r>
-                                <w:proofErr w:type="spellEnd"/>
-                                <w:r>
-                                  <w:rPr>
-                                    <w:rFonts w:ascii="Arial" w:eastAsia="Arial" w:hAnsi="Arial"/>
-                                    <w:i/>
-                                    <w:iCs/>
-                                    <w:color w:val="FFFFFF" w:themeColor="background1"/>
-                                    <w:sz w:val="20"/>
-                                    <w:szCs w:val="20"/>
-                                    <w:lang w:val="nl-NL"/>
-                                  </w:rPr>
-                                  <w:t>}</w:t>
+                                  <w:t>{rapport_nummer}</w:t>
                                 </w:r>
                                 <w:r>
                                   <w:rPr>
@@ -8161,33 +6596,7 @@
                               <w:szCs w:val="20"/>
                               <w:lang w:val="nl-NL"/>
                             </w:rPr>
-                            <w:t>{</w:t>
-                          </w:r>
-                          <w:proofErr w:type="spellStart"/>
-                          <w:r>
-                            <w:rPr>
-                              <w:rFonts w:ascii="Arial" w:eastAsia="Arial" w:hAnsi="Arial"/>
-                              <w:i/>
-                              <w:iCs/>
-                              <w:color w:val="FFFFFF" w:themeColor="background1"/>
-                              <w:sz w:val="20"/>
-                              <w:szCs w:val="20"/>
-                              <w:lang w:val="nl-NL"/>
-                            </w:rPr>
-                            <w:t>rapport_nummer</w:t>
-                          </w:r>
-                          <w:proofErr w:type="spellEnd"/>
-                          <w:r>
-                            <w:rPr>
-                              <w:rFonts w:ascii="Arial" w:eastAsia="Arial" w:hAnsi="Arial"/>
-                              <w:i/>
-                              <w:iCs/>
-                              <w:color w:val="FFFFFF" w:themeColor="background1"/>
-                              <w:sz w:val="20"/>
-                              <w:szCs w:val="20"/>
-                              <w:lang w:val="nl-NL"/>
-                            </w:rPr>
-                            <w:t>}</w:t>
+                            <w:t>{rapport_nummer}</w:t>
                           </w:r>
                           <w:r>
                             <w:rPr>

</xml_diff>